<commit_message>
docs: DOC-06 1.3, DOC-07 1.2, DOC-10 1.4 e DOC-11 1.3 regenerados
</commit_message>
<xml_diff>
--- a/docs/DOC-06_Catalogo_de_Fontes.docx
+++ b/docs/DOC-06_Catalogo_de_Fontes.docx
@@ -267,7 +267,7 @@
                 <w:sz w:val="19"/>
                 <w:szCs w:val="19"/>
               </w:rPr>
-              <w:t xml:space="preserve">1.2</w:t>
+              <w:t xml:space="preserve">1.3</w:t>
             </w:r>
           </w:p>
         </w:tc>
@@ -326,7 +326,7 @@
                 <w:sz w:val="19"/>
                 <w:szCs w:val="19"/>
               </w:rPr>
-              <w:t xml:space="preserve">6 de outubro de 2026</w:t>
+              <w:t xml:space="preserve">9 de outubro de 2026</w:t>
             </w:r>
           </w:p>
         </w:tc>
@@ -385,7 +385,7 @@
                 <w:sz w:val="19"/>
                 <w:szCs w:val="19"/>
               </w:rPr>
-              <w:t xml:space="preserve">Atualizado com o comportamento real das fontes da Fase 1 e as fontes da aba Eleições (inclusive 1933 a 1990)</w:t>
+              <w:t xml:space="preserve">Atualizado com o comportamento real das fontes da Fase 1, as da aba Eleições e as de referência de mercado (seção 2.8)</w:t>
             </w:r>
           </w:p>
         </w:tc>
@@ -6854,6 +6854,596 @@
       </w:r>
     </w:p>
     <w:p>
+      <w:pPr>
+        <w:pStyle w:val="Heading2"/>
+        <w:keepNext/>
+        <w:keepLines/>
+        <w:spacing w:after="120" w:before="280"/>
+      </w:pPr>
+      <w:r>
+        <w:t xml:space="preserve">2.8 Referência de mercado de fora do governo (regra A-05)</w:t>
+      </w:r>
+    </w:p>
+    <w:p>
+      <w:pPr>
+        <w:spacing w:after="120"/>
+      </w:pPr>
+      <w:r>
+        <w:rPr>
+          <w:b w:val="false"/>
+          <w:bCs w:val="false"/>
+          <w:i w:val="false"/>
+          <w:iCs w:val="false"/>
+        </w:rPr>
+        <w:t xml:space="preserve">Fontes que não são compras públicas e servem de régua para o preço que o governo pagou (ADR-027). Nenhuma delas é usada para afirmar nada sobre um ente: a regra A-05 roda em modo silencioso até a calibração.</w:t>
+      </w:r>
+    </w:p>
+    <w:tbl>
+      <w:tblPr>
+        <w:tblW w:type="dxa" w:w="9600"/>
+        <w:tblBorders>
+          <w:top w:val="single" w:color="BFBFBF" w:sz="4"/>
+          <w:left w:val="single" w:color="BFBFBF" w:sz="4"/>
+          <w:bottom w:val="single" w:color="BFBFBF" w:sz="4"/>
+          <w:right w:val="single" w:color="BFBFBF" w:sz="4"/>
+          <w:insideH w:val="single" w:color="D9D9D9" w:sz="2"/>
+          <w:insideV w:val="single" w:color="D9D9D9" w:sz="2"/>
+        </w:tblBorders>
+      </w:tblPr>
+      <w:tblGrid>
+        <w:gridCol w:w="2200"/>
+        <w:gridCol w:w="3800"/>
+        <w:gridCol w:w="3600"/>
+      </w:tblGrid>
+      <w:tr>
+        <w:trPr>
+          <w:tblHeader/>
+        </w:trPr>
+        <w:tc>
+          <w:tcPr>
+            <w:tcW w:type="dxa" w:w="2200"/>
+            <w:shd w:fill="1F3864" w:val="clear"/>
+            <w:tcMar>
+              <w:top w:type="dxa" w:w="80"/>
+              <w:left w:type="dxa" w:w="110"/>
+              <w:bottom w:type="dxa" w:w="80"/>
+              <w:right w:type="dxa" w:w="110"/>
+            </w:tcMar>
+            <w:vAlign w:val="center"/>
+          </w:tcPr>
+          <w:p>
+            <w:pPr>
+              <w:spacing w:after="0"/>
+            </w:pPr>
+            <w:r>
+              <w:rPr>
+                <w:b/>
+                <w:bCs/>
+                <w:color w:val="FFFFFF"/>
+                <w:sz w:val="19"/>
+                <w:szCs w:val="19"/>
+              </w:rPr>
+              <w:t xml:space="preserve">Fonte</w:t>
+            </w:r>
+          </w:p>
+        </w:tc>
+        <w:tc>
+          <w:tcPr>
+            <w:tcW w:type="dxa" w:w="3800"/>
+            <w:shd w:fill="1F3864" w:val="clear"/>
+            <w:tcMar>
+              <w:top w:type="dxa" w:w="80"/>
+              <w:left w:type="dxa" w:w="110"/>
+              <w:bottom w:type="dxa" w:w="80"/>
+              <w:right w:type="dxa" w:w="110"/>
+            </w:tcMar>
+            <w:vAlign w:val="center"/>
+          </w:tcPr>
+          <w:p>
+            <w:pPr>
+              <w:spacing w:after="0"/>
+            </w:pPr>
+            <w:r>
+              <w:rPr>
+                <w:b/>
+                <w:bCs/>
+                <w:color w:val="FFFFFF"/>
+                <w:sz w:val="19"/>
+                <w:szCs w:val="19"/>
+              </w:rPr>
+              <w:t xml:space="preserve">Endereço</w:t>
+            </w:r>
+          </w:p>
+        </w:tc>
+        <w:tc>
+          <w:tcPr>
+            <w:tcW w:type="dxa" w:w="3600"/>
+            <w:shd w:fill="1F3864" w:val="clear"/>
+            <w:tcMar>
+              <w:top w:type="dxa" w:w="80"/>
+              <w:left w:type="dxa" w:w="110"/>
+              <w:bottom w:type="dxa" w:w="80"/>
+              <w:right w:type="dxa" w:w="110"/>
+            </w:tcMar>
+            <w:vAlign w:val="center"/>
+          </w:tcPr>
+          <w:p>
+            <w:pPr>
+              <w:spacing w:after="0"/>
+            </w:pPr>
+            <w:r>
+              <w:rPr>
+                <w:b/>
+                <w:bCs/>
+                <w:color w:val="FFFFFF"/>
+                <w:sz w:val="19"/>
+                <w:szCs w:val="19"/>
+              </w:rPr>
+              <w:t xml:space="preserve">Formato e comportamento</w:t>
+            </w:r>
+          </w:p>
+        </w:tc>
+      </w:tr>
+      <w:tr>
+        <w:trPr>
+          <w:cantSplit/>
+        </w:trPr>
+        <w:tc>
+          <w:tcPr>
+            <w:tcW w:type="dxa" w:w="2200"/>
+            <w:shd w:fill="FFFFFF" w:val="clear"/>
+            <w:tcMar>
+              <w:top w:type="dxa" w:w="70"/>
+              <w:left w:type="dxa" w:w="110"/>
+              <w:bottom w:type="dxa" w:w="70"/>
+              <w:right w:type="dxa" w:w="110"/>
+            </w:tcMar>
+            <w:vAlign w:val="center"/>
+          </w:tcPr>
+          <w:p>
+            <w:pPr>
+              <w:spacing w:after="0"/>
+            </w:pPr>
+            <w:r>
+              <w:rPr>
+                <w:b w:val="false"/>
+                <w:bCs w:val="false"/>
+                <w:sz w:val="17"/>
+                <w:szCs w:val="17"/>
+              </w:rPr>
+              <w:t xml:space="preserve">ANP — série histórica de preços de combustíveis</w:t>
+            </w:r>
+          </w:p>
+        </w:tc>
+        <w:tc>
+          <w:tcPr>
+            <w:tcW w:type="dxa" w:w="3800"/>
+            <w:shd w:fill="FFFFFF" w:val="clear"/>
+            <w:tcMar>
+              <w:top w:type="dxa" w:w="70"/>
+              <w:left w:type="dxa" w:w="110"/>
+              <w:bottom w:type="dxa" w:w="70"/>
+              <w:right w:type="dxa" w:w="110"/>
+            </w:tcMar>
+            <w:vAlign w:val="center"/>
+          </w:tcPr>
+          <w:p>
+            <w:pPr>
+              <w:spacing w:after="0"/>
+            </w:pPr>
+            <w:r>
+              <w:rPr>
+                <w:b w:val="false"/>
+                <w:bCs w:val="false"/>
+                <w:sz w:val="17"/>
+                <w:szCs w:val="17"/>
+              </w:rPr>
+              <w:t xml:space="preserve">gov.br/anp/.../dados-abertos/arquivos/shpc/dsas/ca/ca-AAAA-0S.zip (até 2021, .csv; o 1º semestre de 2022 é precos-semestrais-ca.zip)</w:t>
+            </w:r>
+          </w:p>
+        </w:tc>
+        <w:tc>
+          <w:tcPr>
+            <w:tcW w:type="dxa" w:w="3600"/>
+            <w:shd w:fill="FFFFFF" w:val="clear"/>
+            <w:tcMar>
+              <w:top w:type="dxa" w:w="70"/>
+              <w:left w:type="dxa" w:w="110"/>
+              <w:bottom w:type="dxa" w:w="70"/>
+              <w:right w:type="dxa" w:w="110"/>
+            </w:tcMar>
+            <w:vAlign w:val="center"/>
+          </w:tcPr>
+          <w:p>
+            <w:pPr>
+              <w:spacing w:after="0"/>
+            </w:pPr>
+            <w:r>
+              <w:rPr>
+                <w:b w:val="false"/>
+                <w:bCs w:val="false"/>
+                <w:sz w:val="17"/>
+                <w:szCs w:val="17"/>
+              </w:rPr>
+              <w:t xml:space="preserve">CSV com ;, uma linha por posto, produto e semana: UF, município, revenda e CNPJ, produto, data da coleta, valor de venda com vírgula decimal. Arquivo semestral, publicado depois do fim do semestre; desde 2006. Leitura tolerante a nome de coluna, separador e codificação.</w:t>
+            </w:r>
+          </w:p>
+        </w:tc>
+      </w:tr>
+      <w:tr>
+        <w:trPr>
+          <w:cantSplit/>
+        </w:trPr>
+        <w:tc>
+          <w:tcPr>
+            <w:tcW w:type="dxa" w:w="2200"/>
+            <w:shd w:fill="F2F2F2" w:val="clear"/>
+            <w:tcMar>
+              <w:top w:type="dxa" w:w="70"/>
+              <w:left w:type="dxa" w:w="110"/>
+              <w:bottom w:type="dxa" w:w="70"/>
+              <w:right w:type="dxa" w:w="110"/>
+            </w:tcMar>
+            <w:vAlign w:val="center"/>
+          </w:tcPr>
+          <w:p>
+            <w:pPr>
+              <w:spacing w:after="0"/>
+            </w:pPr>
+            <w:r>
+              <w:rPr>
+                <w:b w:val="false"/>
+                <w:bCs w:val="false"/>
+                <w:sz w:val="17"/>
+                <w:szCs w:val="17"/>
+              </w:rPr>
+              <w:t xml:space="preserve">ANP — série histórica do gás de cozinha</w:t>
+            </w:r>
+          </w:p>
+        </w:tc>
+        <w:tc>
+          <w:tcPr>
+            <w:tcW w:type="dxa" w:w="3800"/>
+            <w:shd w:fill="F2F2F2" w:val="clear"/>
+            <w:tcMar>
+              <w:top w:type="dxa" w:w="70"/>
+              <w:left w:type="dxa" w:w="110"/>
+              <w:bottom w:type="dxa" w:w="70"/>
+              <w:right w:type="dxa" w:w="110"/>
+            </w:tcMar>
+            <w:vAlign w:val="center"/>
+          </w:tcPr>
+          <w:p>
+            <w:pPr>
+              <w:spacing w:after="0"/>
+            </w:pPr>
+            <w:r>
+              <w:rPr>
+                <w:b w:val="false"/>
+                <w:bCs w:val="false"/>
+                <w:sz w:val="17"/>
+                <w:szCs w:val="17"/>
+              </w:rPr>
+              <w:t xml:space="preserve">mesma pasta, série glp (glp-AAAA-0S), padrão de endereço a conferir pelo teste de contrato</w:t>
+            </w:r>
+          </w:p>
+        </w:tc>
+        <w:tc>
+          <w:tcPr>
+            <w:tcW w:type="dxa" w:w="3600"/>
+            <w:shd w:fill="F2F2F2" w:val="clear"/>
+            <w:tcMar>
+              <w:top w:type="dxa" w:w="70"/>
+              <w:left w:type="dxa" w:w="110"/>
+              <w:bottom w:type="dxa" w:w="70"/>
+              <w:right w:type="dxa" w:w="110"/>
+            </w:tcMar>
+            <w:vAlign w:val="center"/>
+          </w:tcPr>
+          <w:p>
+            <w:pPr>
+              <w:spacing w:after="0"/>
+            </w:pPr>
+            <w:r>
+              <w:rPr>
+                <w:b w:val="false"/>
+                <w:bCs w:val="false"/>
+                <w:sz w:val="17"/>
+                <w:szCs w:val="17"/>
+              </w:rPr>
+              <w:t xml:space="preserve">Mesmo formato da série de combustíveis, com o preço do botijão de 13 kg (R$ / 13 kg).</w:t>
+            </w:r>
+          </w:p>
+        </w:tc>
+      </w:tr>
+      <w:tr>
+        <w:trPr>
+          <w:cantSplit/>
+        </w:trPr>
+        <w:tc>
+          <w:tcPr>
+            <w:tcW w:type="dxa" w:w="2200"/>
+            <w:shd w:fill="FFFFFF" w:val="clear"/>
+            <w:tcMar>
+              <w:top w:type="dxa" w:w="70"/>
+              <w:left w:type="dxa" w:w="110"/>
+              <w:bottom w:type="dxa" w:w="70"/>
+              <w:right w:type="dxa" w:w="110"/>
+            </w:tcMar>
+            <w:vAlign w:val="center"/>
+          </w:tcPr>
+          <w:p>
+            <w:pPr>
+              <w:spacing w:after="0"/>
+            </w:pPr>
+            <w:r>
+              <w:rPr>
+                <w:b w:val="false"/>
+                <w:bCs w:val="false"/>
+                <w:sz w:val="17"/>
+                <w:szCs w:val="17"/>
+              </w:rPr>
+              <w:t xml:space="preserve">ANP — levantamento das últimas semanas</w:t>
+            </w:r>
+          </w:p>
+        </w:tc>
+        <w:tc>
+          <w:tcPr>
+            <w:tcW w:type="dxa" w:w="3800"/>
+            <w:shd w:fill="FFFFFF" w:val="clear"/>
+            <w:tcMar>
+              <w:top w:type="dxa" w:w="70"/>
+              <w:left w:type="dxa" w:w="110"/>
+              <w:bottom w:type="dxa" w:w="70"/>
+              <w:right w:type="dxa" w:w="110"/>
+            </w:tcMar>
+            <w:vAlign w:val="center"/>
+          </w:tcPr>
+          <w:p>
+            <w:pPr>
+              <w:spacing w:after="0"/>
+            </w:pPr>
+            <w:r>
+              <w:rPr>
+                <w:b w:val="false"/>
+                <w:bCs w:val="false"/>
+                <w:sz w:val="17"/>
+                <w:szCs w:val="17"/>
+              </w:rPr>
+              <w:t xml:space="preserve">gov.br/anp/.../precos/levantamento-de-precos-de-combustiveis-ultimas-semanas-pesquisadas; planilhas em arquivos-lpc/AAAA/revendas_lpc_&lt;início&gt;_&lt;fim&gt;.xlsx</w:t>
+            </w:r>
+          </w:p>
+        </w:tc>
+        <w:tc>
+          <w:tcPr>
+            <w:tcW w:type="dxa" w:w="3600"/>
+            <w:shd w:fill="FFFFFF" w:val="clear"/>
+            <w:tcMar>
+              <w:top w:type="dxa" w:w="70"/>
+              <w:left w:type="dxa" w:w="110"/>
+              <w:bottom w:type="dxa" w:w="70"/>
+              <w:right w:type="dxa" w:w="110"/>
+            </w:tcMar>
+            <w:vAlign w:val="center"/>
+          </w:tcPr>
+          <w:p>
+            <w:pPr>
+              <w:spacing w:after="0"/>
+            </w:pPr>
+            <w:r>
+              <w:rPr>
+                <w:b w:val="false"/>
+                <w:bCs w:val="false"/>
+                <w:sz w:val="17"/>
+                <w:szCs w:val="17"/>
+              </w:rPr>
+              <w:t xml:space="preserve">Planilha .xlsx por semana, posto a posto, com combustíveis e GLP: título antes do cabeçalho, UF pelo nome do estado, data como número de série do Excel, nomes de produto próprios (GASOLINA COMUM, ETANOL HIDRATADO, OLEO DIESEL S10). O nome do arquivo não segue padrão fixo (2026-08-30-2026-09-5): os endereços são tirados da página. A página guarda só as semanas recentes, por isso a planilha vai para o bronze ao ser baixada. Lida sem dependências (lumen_mercado/xlsx.py).</w:t>
+            </w:r>
+          </w:p>
+        </w:tc>
+      </w:tr>
+      <w:tr>
+        <w:trPr>
+          <w:cantSplit/>
+        </w:trPr>
+        <w:tc>
+          <w:tcPr>
+            <w:tcW w:type="dxa" w:w="2200"/>
+            <w:shd w:fill="F2F2F2" w:val="clear"/>
+            <w:tcMar>
+              <w:top w:type="dxa" w:w="70"/>
+              <w:left w:type="dxa" w:w="110"/>
+              <w:bottom w:type="dxa" w:w="70"/>
+              <w:right w:type="dxa" w:w="110"/>
+            </w:tcMar>
+            <w:vAlign w:val="center"/>
+          </w:tcPr>
+          <w:p>
+            <w:pPr>
+              <w:spacing w:after="0"/>
+            </w:pPr>
+            <w:r>
+              <w:rPr>
+                <w:b w:val="false"/>
+                <w:bCs w:val="false"/>
+                <w:sz w:val="17"/>
+                <w:szCs w:val="17"/>
+              </w:rPr>
+              <w:t xml:space="preserve">Mercado Livre — busca</w:t>
+            </w:r>
+          </w:p>
+        </w:tc>
+        <w:tc>
+          <w:tcPr>
+            <w:tcW w:type="dxa" w:w="3800"/>
+            <w:shd w:fill="F2F2F2" w:val="clear"/>
+            <w:tcMar>
+              <w:top w:type="dxa" w:w="70"/>
+              <w:left w:type="dxa" w:w="110"/>
+              <w:bottom w:type="dxa" w:w="70"/>
+              <w:right w:type="dxa" w:w="110"/>
+            </w:tcMar>
+            <w:vAlign w:val="center"/>
+          </w:tcPr>
+          <w:p>
+            <w:pPr>
+              <w:spacing w:after="0"/>
+            </w:pPr>
+            <w:r>
+              <w:rPr>
+                <w:b w:val="false"/>
+                <w:bCs w:val="false"/>
+                <w:sz w:val="17"/>
+                <w:szCs w:val="17"/>
+              </w:rPr>
+              <w:t xml:space="preserve">api.mercadolibre.com/sites/MLB/search?q=…</w:t>
+            </w:r>
+          </w:p>
+        </w:tc>
+        <w:tc>
+          <w:tcPr>
+            <w:tcW w:type="dxa" w:w="3600"/>
+            <w:shd w:fill="F2F2F2" w:val="clear"/>
+            <w:tcMar>
+              <w:top w:type="dxa" w:w="70"/>
+              <w:left w:type="dxa" w:w="110"/>
+              <w:bottom w:type="dxa" w:w="70"/>
+              <w:right w:type="dxa" w:w="110"/>
+            </w:tcMar>
+            <w:vAlign w:val="center"/>
+          </w:tcPr>
+          <w:p>
+            <w:pPr>
+              <w:spacing w:after="0"/>
+            </w:pPr>
+            <w:r>
+              <w:rPr>
+                <w:b w:val="false"/>
+                <w:bCs w:val="false"/>
+                <w:sz w:val="17"/>
+                <w:szCs w:val="17"/>
+              </w:rPr>
+              <w:t xml:space="preserve">JSON com results (id, title, price, currency_id, condition, permalink, seller, shipping). API oficial; a credencial, quando exigida, vem de LUMEN_ML_TOKEN. Só o preço de hoje: coleta diária guardada no bronze.</w:t>
+            </w:r>
+          </w:p>
+        </w:tc>
+      </w:tr>
+      <w:tr>
+        <w:trPr>
+          <w:cantSplit/>
+        </w:trPr>
+        <w:tc>
+          <w:tcPr>
+            <w:tcW w:type="dxa" w:w="2200"/>
+            <w:shd w:fill="FFFFFF" w:val="clear"/>
+            <w:tcMar>
+              <w:top w:type="dxa" w:w="70"/>
+              <w:left w:type="dxa" w:w="110"/>
+              <w:bottom w:type="dxa" w:w="70"/>
+              <w:right w:type="dxa" w:w="110"/>
+            </w:tcMar>
+            <w:vAlign w:val="center"/>
+          </w:tcPr>
+          <w:p>
+            <w:pPr>
+              <w:spacing w:after="0"/>
+            </w:pPr>
+            <w:r>
+              <w:rPr>
+                <w:b w:val="false"/>
+                <w:bCs w:val="false"/>
+                <w:sz w:val="17"/>
+                <w:szCs w:val="17"/>
+              </w:rPr>
+              <w:t xml:space="preserve">Notas fiscais ao consumidor (Menor Preço/PR, Preço da Hora/BA)</w:t>
+            </w:r>
+          </w:p>
+        </w:tc>
+        <w:tc>
+          <w:tcPr>
+            <w:tcW w:type="dxa" w:w="3800"/>
+            <w:shd w:fill="FFFFFF" w:val="clear"/>
+            <w:tcMar>
+              <w:top w:type="dxa" w:w="70"/>
+              <w:left w:type="dxa" w:w="110"/>
+              <w:bottom w:type="dxa" w:w="70"/>
+              <w:right w:type="dxa" w:w="110"/>
+            </w:tcMar>
+            <w:vAlign w:val="center"/>
+          </w:tcPr>
+          <w:p>
+            <w:pPr>
+              <w:spacing w:after="0"/>
+            </w:pPr>
+            <w:r>
+              <w:rPr>
+                <w:b w:val="false"/>
+                <w:bCs w:val="false"/>
+                <w:sz w:val="17"/>
+                <w:szCs w:val="17"/>
+              </w:rPr>
+              <w:t xml:space="preserve">menorpreco.notaparana.pr.gov.br; precodahora.ba.gov.br</w:t>
+            </w:r>
+          </w:p>
+        </w:tc>
+        <w:tc>
+          <w:tcPr>
+            <w:tcW w:type="dxa" w:w="3600"/>
+            <w:shd w:fill="FFFFFF" w:val="clear"/>
+            <w:tcMar>
+              <w:top w:type="dxa" w:w="70"/>
+              <w:left w:type="dxa" w:w="110"/>
+              <w:bottom w:type="dxa" w:w="70"/>
+              <w:right w:type="dxa" w:w="110"/>
+            </w:tcMar>
+            <w:vAlign w:val="center"/>
+          </w:tcPr>
+          <w:p>
+            <w:pPr>
+              <w:spacing w:after="0"/>
+            </w:pPr>
+            <w:r>
+              <w:rPr>
+                <w:b w:val="false"/>
+                <w:bCs w:val="false"/>
+                <w:sz w:val="17"/>
+                <w:szCs w:val="17"/>
+              </w:rPr>
+              <w:t xml:space="preserve">Preço de venda real por código de barras e lugar; sem API pública. Pedido de acesso pela Lei de Acesso à Informação, a fazer.</w:t>
+            </w:r>
+          </w:p>
+        </w:tc>
+      </w:tr>
+    </w:tbl>
+    <w:p>
+      <w:pPr>
+        <w:spacing w:after="120"/>
+      </w:pPr>
+      <w:r>
+        <w:rPr>
+          <w:b w:val="false"/>
+          <w:bCs w:val="false"/>
+          <w:i w:val="false"/>
+          <w:iCs w:val="false"/>
+        </w:rPr>
+        <w:t xml:space="preserve">Fora por decisão: Magazine Luiza, KaBuM, Pichau e comparadores de preço (Zoom, Buscapé) não têm API pública de preços, e extrair o site contraria os termos de uso e as barreiras contra robôs (seção 5). Amazon (Creators API), AliExpress e Shopee (programas de afiliados) entram quando houver credencial.</w:t>
+      </w:r>
+    </w:p>
+    <w:p>
+      <w:pPr>
+        <w:spacing w:after="120"/>
+      </w:pPr>
+      <w:r>
+        <w:rPr>
+          <w:b w:val="false"/>
+          <w:bCs w:val="false"/>
+          <w:i w:val="false"/>
+          <w:iCs w:val="false"/>
+        </w:rPr>
+        <w:t xml:space="preserve">Limites padrão: 10 requisições por minuto na ANP (arquivos grandes, poucas requisições) e 30 no varejo.</w:t>
+      </w:r>
+    </w:p>
+    <w:p>
       <w:r>
         <w:br w:type="page"/>
       </w:r>
@@ -10804,7 +11394,7 @@
                 <w:sz w:val="17"/>
                 <w:szCs w:val="17"/>
               </w:rPr>
-              <w:t xml:space="preserve">Conector e normalizador prontos</w:t>
+              <w:t xml:space="preserve">Integrado sob demanda</w:t>
             </w:r>
           </w:p>
         </w:tc>
@@ -10831,7 +11421,7 @@
                 <w:sz w:val="17"/>
                 <w:szCs w:val="17"/>
               </w:rPr>
-              <w:t xml:space="preserve">Fora do pipeline padrão até a Fase 2, que usa os itens nas regras de preço</w:t>
+              <w:t xml:space="preserve">lumen coletar pncp_itens --objeto busca os itens só dos processos da silver que interessam (regra A-05)</w:t>
             </w:r>
           </w:p>
         </w:tc>
@@ -11551,7 +12141,7 @@
                 <w:sz w:val="17"/>
                 <w:szCs w:val="17"/>
               </w:rPr>
-              <w:t xml:space="preserve">Compras.gov.br, estados, tribunais de contas, municípios</w:t>
+              <w:t xml:space="preserve">ANP — preços de combustíveis e GLP</w:t>
             </w:r>
           </w:p>
         </w:tc>
@@ -11578,6 +12168,264 @@
                 <w:sz w:val="17"/>
                 <w:szCs w:val="17"/>
               </w:rPr>
+              <w:t xml:space="preserve">Integrado (regra A-05)</w:t>
+            </w:r>
+          </w:p>
+        </w:tc>
+        <w:tc>
+          <w:tcPr>
+            <w:tcW w:type="dxa" w:w="4200"/>
+            <w:shd w:fill="FFFFFF" w:val="clear"/>
+            <w:tcMar>
+              <w:top w:type="dxa" w:w="70"/>
+              <w:left w:type="dxa" w:w="110"/>
+              <w:bottom w:type="dxa" w:w="70"/>
+              <w:right w:type="dxa" w:w="110"/>
+            </w:tcMar>
+            <w:vAlign w:val="center"/>
+          </w:tcPr>
+          <w:p>
+            <w:pPr>
+              <w:spacing w:after="0"/>
+            </w:pPr>
+            <w:r>
+              <w:rPr>
+                <w:b w:val="false"/>
+                <w:bCs w:val="false"/>
+                <w:sz w:val="17"/>
+                <w:szCs w:val="17"/>
+              </w:rPr>
+              <w:t xml:space="preserve">Série semestral (ca e glp) e planilhas semanais das últimas semanas; formato real a conferir pela primeira execução do fluxo mercado-referencia</w:t>
+            </w:r>
+          </w:p>
+        </w:tc>
+      </w:tr>
+      <w:tr>
+        <w:trPr>
+          <w:cantSplit/>
+        </w:trPr>
+        <w:tc>
+          <w:tcPr>
+            <w:tcW w:type="dxa" w:w="3000"/>
+            <w:shd w:fill="F2F2F2" w:val="clear"/>
+            <w:tcMar>
+              <w:top w:type="dxa" w:w="70"/>
+              <w:left w:type="dxa" w:w="110"/>
+              <w:bottom w:type="dxa" w:w="70"/>
+              <w:right w:type="dxa" w:w="110"/>
+            </w:tcMar>
+            <w:vAlign w:val="center"/>
+          </w:tcPr>
+          <w:p>
+            <w:pPr>
+              <w:spacing w:after="0"/>
+            </w:pPr>
+            <w:r>
+              <w:rPr>
+                <w:b w:val="false"/>
+                <w:bCs w:val="false"/>
+                <w:sz w:val="17"/>
+                <w:szCs w:val="17"/>
+              </w:rPr>
+              <w:t xml:space="preserve">Mercado Livre — busca</w:t>
+            </w:r>
+          </w:p>
+        </w:tc>
+        <w:tc>
+          <w:tcPr>
+            <w:tcW w:type="dxa" w:w="2400"/>
+            <w:shd w:fill="F2F2F2" w:val="clear"/>
+            <w:tcMar>
+              <w:top w:type="dxa" w:w="70"/>
+              <w:left w:type="dxa" w:w="110"/>
+              <w:bottom w:type="dxa" w:w="70"/>
+              <w:right w:type="dxa" w:w="110"/>
+            </w:tcMar>
+            <w:vAlign w:val="center"/>
+          </w:tcPr>
+          <w:p>
+            <w:pPr>
+              <w:spacing w:after="0"/>
+            </w:pPr>
+            <w:r>
+              <w:rPr>
+                <w:b w:val="false"/>
+                <w:bCs w:val="false"/>
+                <w:sz w:val="17"/>
+                <w:szCs w:val="17"/>
+              </w:rPr>
+              <w:t xml:space="preserve">Conector pronto, a validar</w:t>
+            </w:r>
+          </w:p>
+        </w:tc>
+        <w:tc>
+          <w:tcPr>
+            <w:tcW w:type="dxa" w:w="4200"/>
+            <w:shd w:fill="F2F2F2" w:val="clear"/>
+            <w:tcMar>
+              <w:top w:type="dxa" w:w="70"/>
+              <w:left w:type="dxa" w:w="110"/>
+              <w:bottom w:type="dxa" w:w="70"/>
+              <w:right w:type="dxa" w:w="110"/>
+            </w:tcMar>
+            <w:vAlign w:val="center"/>
+          </w:tcPr>
+          <w:p>
+            <w:pPr>
+              <w:spacing w:after="0"/>
+            </w:pPr>
+            <w:r>
+              <w:rPr>
+                <w:b w:val="false"/>
+                <w:bCs w:val="false"/>
+                <w:sz w:val="17"/>
+                <w:szCs w:val="17"/>
+              </w:rPr>
+              <w:t xml:space="preserve">Formato e acesso conferidos pela primeira coleta real e pelo teste de contrato</w:t>
+            </w:r>
+          </w:p>
+        </w:tc>
+      </w:tr>
+      <w:tr>
+        <w:trPr>
+          <w:cantSplit/>
+        </w:trPr>
+        <w:tc>
+          <w:tcPr>
+            <w:tcW w:type="dxa" w:w="3000"/>
+            <w:shd w:fill="FFFFFF" w:val="clear"/>
+            <w:tcMar>
+              <w:top w:type="dxa" w:w="70"/>
+              <w:left w:type="dxa" w:w="110"/>
+              <w:bottom w:type="dxa" w:w="70"/>
+              <w:right w:type="dxa" w:w="110"/>
+            </w:tcMar>
+            <w:vAlign w:val="center"/>
+          </w:tcPr>
+          <w:p>
+            <w:pPr>
+              <w:spacing w:after="0"/>
+            </w:pPr>
+            <w:r>
+              <w:rPr>
+                <w:b w:val="false"/>
+                <w:bCs w:val="false"/>
+                <w:sz w:val="17"/>
+                <w:szCs w:val="17"/>
+              </w:rPr>
+              <w:t xml:space="preserve">Notas fiscais ao consumidor (estados)</w:t>
+            </w:r>
+          </w:p>
+        </w:tc>
+        <w:tc>
+          <w:tcPr>
+            <w:tcW w:type="dxa" w:w="2400"/>
+            <w:shd w:fill="FFFFFF" w:val="clear"/>
+            <w:tcMar>
+              <w:top w:type="dxa" w:w="70"/>
+              <w:left w:type="dxa" w:w="110"/>
+              <w:bottom w:type="dxa" w:w="70"/>
+              <w:right w:type="dxa" w:w="110"/>
+            </w:tcMar>
+            <w:vAlign w:val="center"/>
+          </w:tcPr>
+          <w:p>
+            <w:pPr>
+              <w:spacing w:after="0"/>
+            </w:pPr>
+            <w:r>
+              <w:rPr>
+                <w:b w:val="false"/>
+                <w:bCs w:val="false"/>
+                <w:sz w:val="17"/>
+                <w:szCs w:val="17"/>
+              </w:rPr>
+              <w:t xml:space="preserve">Pendente</w:t>
+            </w:r>
+          </w:p>
+        </w:tc>
+        <w:tc>
+          <w:tcPr>
+            <w:tcW w:type="dxa" w:w="4200"/>
+            <w:shd w:fill="FFFFFF" w:val="clear"/>
+            <w:tcMar>
+              <w:top w:type="dxa" w:w="70"/>
+              <w:left w:type="dxa" w:w="110"/>
+              <w:bottom w:type="dxa" w:w="70"/>
+              <w:right w:type="dxa" w:w="110"/>
+            </w:tcMar>
+            <w:vAlign w:val="center"/>
+          </w:tcPr>
+          <w:p>
+            <w:pPr>
+              <w:spacing w:after="0"/>
+            </w:pPr>
+            <w:r>
+              <w:rPr>
+                <w:b w:val="false"/>
+                <w:bCs w:val="false"/>
+                <w:sz w:val="17"/>
+                <w:szCs w:val="17"/>
+              </w:rPr>
+              <w:t xml:space="preserve">Pedido pela Lei de Acesso à Informação</w:t>
+            </w:r>
+          </w:p>
+        </w:tc>
+      </w:tr>
+      <w:tr>
+        <w:trPr>
+          <w:cantSplit/>
+        </w:trPr>
+        <w:tc>
+          <w:tcPr>
+            <w:tcW w:type="dxa" w:w="3000"/>
+            <w:shd w:fill="F2F2F2" w:val="clear"/>
+            <w:tcMar>
+              <w:top w:type="dxa" w:w="70"/>
+              <w:left w:type="dxa" w:w="110"/>
+              <w:bottom w:type="dxa" w:w="70"/>
+              <w:right w:type="dxa" w:w="110"/>
+            </w:tcMar>
+            <w:vAlign w:val="center"/>
+          </w:tcPr>
+          <w:p>
+            <w:pPr>
+              <w:spacing w:after="0"/>
+            </w:pPr>
+            <w:r>
+              <w:rPr>
+                <w:b w:val="false"/>
+                <w:bCs w:val="false"/>
+                <w:sz w:val="17"/>
+                <w:szCs w:val="17"/>
+              </w:rPr>
+              <w:t xml:space="preserve">Compras.gov.br, estados, tribunais de contas, municípios</w:t>
+            </w:r>
+          </w:p>
+        </w:tc>
+        <w:tc>
+          <w:tcPr>
+            <w:tcW w:type="dxa" w:w="2400"/>
+            <w:shd w:fill="F2F2F2" w:val="clear"/>
+            <w:tcMar>
+              <w:top w:type="dxa" w:w="70"/>
+              <w:left w:type="dxa" w:w="110"/>
+              <w:bottom w:type="dxa" w:w="70"/>
+              <w:right w:type="dxa" w:w="110"/>
+            </w:tcMar>
+            <w:vAlign w:val="center"/>
+          </w:tcPr>
+          <w:p>
+            <w:pPr>
+              <w:spacing w:after="0"/>
+            </w:pPr>
+            <w:r>
+              <w:rPr>
+                <w:b w:val="false"/>
+                <w:bCs w:val="false"/>
+                <w:sz w:val="17"/>
+                <w:szCs w:val="17"/>
+              </w:rPr>
               <w:t xml:space="preserve">Planejado</w:t>
             </w:r>
           </w:p>
@@ -11585,7 +12433,7 @@
         <w:tc>
           <w:tcPr>
             <w:tcW w:type="dxa" w:w="4200"/>
-            <w:shd w:fill="FFFFFF" w:val="clear"/>
+            <w:shd w:fill="F2F2F2" w:val="clear"/>
             <w:tcMar>
               <w:top w:type="dxa" w:w="70"/>
               <w:left w:type="dxa" w:w="110"/>

</xml_diff>

<commit_message>
docs: DOC-06 e DOC-11 regenerados
</commit_message>
<xml_diff>
--- a/docs/DOC-06_Catalogo_de_Fontes.docx
+++ b/docs/DOC-06_Catalogo_de_Fontes.docx
@@ -7124,7 +7124,7 @@
                 <w:sz w:val="17"/>
                 <w:szCs w:val="17"/>
               </w:rPr>
-              <w:t xml:space="preserve">mesma pasta, série glp (glp-AAAA-0S), padrão de endereço a conferir pelo teste de contrato</w:t>
+              <w:t xml:space="preserve">gov.br/anp/.../dsas/glp/glp-AAAA-0S.csv, sempre .csv, desde 2004 (2021-1 é precos-semestrais-glp2021-01.csv e 2022-1, precos-semestrais-glp-2022-01.csv)</w:t>
             </w:r>
           </w:p>
         </w:tc>
@@ -7237,7 +7237,7 @@
                 <w:sz w:val="17"/>
                 <w:szCs w:val="17"/>
               </w:rPr>
-              <w:t xml:space="preserve">Planilha .xlsx por semana, posto a posto, com combustíveis e GLP: título antes do cabeçalho, UF pelo nome do estado, data como número de série do Excel, nomes de produto próprios (GASOLINA COMUM, ETANOL HIDRATADO, OLEO DIESEL S10). O nome do arquivo não segue padrão fixo (2026-08-30-2026-09-5): os endereços são tirados da página. A página guarda só as semanas recentes, por isso a planilha vai para o bronze ao ser baixada. Lida sem dependências (lumen_mercado/xlsx.py).</w:t>
+              <w:t xml:space="preserve">Planilha .xlsx por semana (cerca de 1,8 MB e 20 mil coletas), posto a posto, com combustíveis e GLP: sete linhas de título antes do cabeçalho, CNPJ só com dígitos (às vezes sem o zero à esquerda), UF pelo nome do estado, preço como número e data como número de série do Excel, nomes de produto próprios (GASOLINA COMUM, DIESEL S500). O nome do arquivo não segue padrão fixo (2026-08-30-2026-09-5): os endereços são tirados da página, que em outubro de 2026 citava 192 semanas, de setembro de 2022 em diante. Lida sem dependências (lumen_mercado/xlsx.py).</w:t>
             </w:r>
           </w:p>
         </w:tc>
@@ -7323,7 +7323,7 @@
                 <w:sz w:val="17"/>
                 <w:szCs w:val="17"/>
               </w:rPr>
-              <w:t xml:space="preserve">JSON com results (id, title, price, currency_id, condition, permalink, seller, shipping). API oficial; a credencial, quando exigida, vem de LUMEN_ML_TOKEN. Só o preço de hoje: coleta diária guardada no bronze.</w:t>
+              <w:t xml:space="preserve">JSON com results (id, title, price, currency_id, condition, permalink, seller, shipping). API oficial; sem credencial responde 403 (visto em 9/10/2026), e o token vem de LUMEN_ML_TOKEN. Só o preço de hoje: coleta diária guardada no bronze.</w:t>
             </w:r>
           </w:p>
         </w:tc>
@@ -12195,7 +12195,7 @@
                 <w:sz w:val="17"/>
                 <w:szCs w:val="17"/>
               </w:rPr>
-              <w:t xml:space="preserve">Série semestral (ca e glp) e planilhas semanais das últimas semanas; formato real a conferir pela primeira execução do fluxo mercado-referencia</w:t>
+              <w:t xml:space="preserve">Série semestral (ca e glp) e planilhas semanais; formato real conferido na primeira execução do fluxo mercado-referencia (9/10/2026), sem linha descartada</w:t>
             </w:r>
           </w:p>
         </w:tc>

</xml_diff>

<commit_message>
docs: DOC-06 e DOC-11 regenerados com a política do 429
</commit_message>
<xml_diff>
--- a/docs/DOC-06_Catalogo_de_Fontes.docx
+++ b/docs/DOC-06_Catalogo_de_Fontes.docx
@@ -10289,6 +10289,124 @@
                 <w:szCs w:val="19"/>
               </w:rPr>
               <w:t xml:space="preserve">Espera exponencial e suspensão temporária da fonte após falhas sucessivas</w:t>
+            </w:r>
+          </w:p>
+        </w:tc>
+      </w:tr>
+      <w:tr>
+        <w:trPr>
+          <w:cantSplit/>
+        </w:trPr>
+        <w:tc>
+          <w:tcPr>
+            <w:tcW w:type="dxa" w:w="2600"/>
+            <w:shd w:fill="FFFFFF" w:val="clear"/>
+            <w:tcMar>
+              <w:top w:type="dxa" w:w="70"/>
+              <w:left w:type="dxa" w:w="110"/>
+              <w:bottom w:type="dxa" w:w="70"/>
+              <w:right w:type="dxa" w:w="110"/>
+            </w:tcMar>
+            <w:vAlign w:val="center"/>
+          </w:tcPr>
+          <w:p>
+            <w:pPr>
+              <w:spacing w:after="0"/>
+            </w:pPr>
+            <w:r>
+              <w:rPr>
+                <w:b w:val="false"/>
+                <w:bCs w:val="false"/>
+                <w:sz w:val="19"/>
+                <w:szCs w:val="19"/>
+              </w:rPr>
+              <w:t xml:space="preserve">Limite da fonte (429)</w:t>
+            </w:r>
+          </w:p>
+        </w:tc>
+        <w:tc>
+          <w:tcPr>
+            <w:tcW w:type="dxa" w:w="7000"/>
+            <w:shd w:fill="FFFFFF" w:val="clear"/>
+            <w:tcMar>
+              <w:top w:type="dxa" w:w="70"/>
+              <w:left w:type="dxa" w:w="110"/>
+              <w:bottom w:type="dxa" w:w="70"/>
+              <w:right w:type="dxa" w:w="110"/>
+            </w:tcMar>
+            <w:vAlign w:val="center"/>
+          </w:tcPr>
+          <w:p>
+            <w:pPr>
+              <w:spacing w:after="0"/>
+            </w:pPr>
+            <w:r>
+              <w:rPr>
+                <w:b w:val="false"/>
+                <w:bCs w:val="false"/>
+                <w:sz w:val="19"/>
+                <w:szCs w:val="19"/>
+              </w:rPr>
+              <w:t xml:space="preserve">Resposta 429 reduz a vazão da fonte pela metade pelo resto da sessão e espera ao menos 30 s antes de repetir; só conta como falha quando a última tentativa também recebe 429. O PNCP respondeu 429 a 60 requisições por minuto a partir do GitHub Actions em outubro de 2026</w:t>
+            </w:r>
+          </w:p>
+        </w:tc>
+      </w:tr>
+      <w:tr>
+        <w:trPr>
+          <w:cantSplit/>
+        </w:trPr>
+        <w:tc>
+          <w:tcPr>
+            <w:tcW w:type="dxa" w:w="2600"/>
+            <w:shd w:fill="F2F2F2" w:val="clear"/>
+            <w:tcMar>
+              <w:top w:type="dxa" w:w="70"/>
+              <w:left w:type="dxa" w:w="110"/>
+              <w:bottom w:type="dxa" w:w="70"/>
+              <w:right w:type="dxa" w:w="110"/>
+            </w:tcMar>
+            <w:vAlign w:val="center"/>
+          </w:tcPr>
+          <w:p>
+            <w:pPr>
+              <w:spacing w:after="0"/>
+            </w:pPr>
+            <w:r>
+              <w:rPr>
+                <w:b w:val="false"/>
+                <w:bCs w:val="false"/>
+                <w:sz w:val="19"/>
+                <w:szCs w:val="19"/>
+              </w:rPr>
+              <w:t xml:space="preserve">Compressão de transporte</w:t>
+            </w:r>
+          </w:p>
+        </w:tc>
+        <w:tc>
+          <w:tcPr>
+            <w:tcW w:type="dxa" w:w="7000"/>
+            <w:shd w:fill="F2F2F2" w:val="clear"/>
+            <w:tcMar>
+              <w:top w:type="dxa" w:w="70"/>
+              <w:left w:type="dxa" w:w="110"/>
+              <w:bottom w:type="dxa" w:w="70"/>
+              <w:right w:type="dxa" w:w="110"/>
+            </w:tcMar>
+            <w:vAlign w:val="center"/>
+          </w:tcPr>
+          <w:p>
+            <w:pPr>
+              <w:spacing w:after="0"/>
+            </w:pPr>
+            <w:r>
+              <w:rPr>
+                <w:b w:val="false"/>
+                <w:bCs w:val="false"/>
+                <w:sz w:val="19"/>
+                <w:szCs w:val="19"/>
+              </w:rPr>
+              <w:t xml:space="preserve">Resposta com Content-Encoding gzip ou deflate é descomprimida antes do bronze, com o limite de tamanho aplicado ao documento descomprimido (a API do IBGE comprime mesmo sem pedido)</w:t>
             </w:r>
           </w:p>
         </w:tc>

</xml_diff>

<commit_message>
Documentação: ADR-031 e ADR-032, DOC-06 e DOC-10, README, Wiki, fixtures e CHANGELOG
</commit_message>
<xml_diff>
--- a/docs/DOC-06_Catalogo_de_Fontes.docx
+++ b/docs/DOC-06_Catalogo_de_Fontes.docx
@@ -5660,6 +5660,92 @@
                 <w:sz w:val="19"/>
                 <w:szCs w:val="19"/>
               </w:rPr>
+              <w:t xml:space="preserve">PNTP — Radar da Transparência (tribunais de contas e Atricon)</w:t>
+            </w:r>
+          </w:p>
+        </w:tc>
+        <w:tc>
+          <w:tcPr>
+            <w:tcW w:type="dxa" w:w="4600"/>
+            <w:shd w:fill="FFFFFF" w:val="clear"/>
+            <w:tcMar>
+              <w:top w:type="dxa" w:w="70"/>
+              <w:left w:type="dxa" w:w="110"/>
+              <w:bottom w:type="dxa" w:w="70"/>
+              <w:right w:type="dxa" w:w="110"/>
+            </w:tcMar>
+            <w:vAlign w:val="center"/>
+          </w:tcPr>
+          <w:p>
+            <w:pPr>
+              <w:spacing w:after="0"/>
+            </w:pPr>
+            <w:r>
+              <w:rPr>
+                <w:b w:val="false"/>
+                <w:bCs w:val="false"/>
+                <w:sz w:val="19"/>
+                <w:szCs w:val="19"/>
+              </w:rPr>
+              <w:t xml:space="preserve">Avaliação anual dos portais de transparência de 11.697 entidades (2025), com o endereço do portal; base por ciclo em ZIP, lida por Range (ADR-032)</w:t>
+            </w:r>
+          </w:p>
+        </w:tc>
+        <w:tc>
+          <w:tcPr>
+            <w:tcW w:type="dxa" w:w="2400"/>
+            <w:shd w:fill="FFFFFF" w:val="clear"/>
+            <w:tcMar>
+              <w:top w:type="dxa" w:w="70"/>
+              <w:left w:type="dxa" w:w="110"/>
+              <w:bottom w:type="dxa" w:w="70"/>
+              <w:right w:type="dxa" w:w="110"/>
+            </w:tcMar>
+            <w:vAlign w:val="center"/>
+          </w:tcPr>
+          <w:p>
+            <w:pPr>
+              <w:spacing w:after="0"/>
+            </w:pPr>
+            <w:r>
+              <w:rPr>
+                <w:b w:val="false"/>
+                <w:bCs w:val="false"/>
+                <w:sz w:val="19"/>
+                <w:szCs w:val="19"/>
+              </w:rPr>
+              <w:t xml:space="preserve">Em uso (pntp_avaliacoes)</w:t>
+            </w:r>
+          </w:p>
+        </w:tc>
+      </w:tr>
+      <w:tr>
+        <w:trPr>
+          <w:cantSplit/>
+        </w:trPr>
+        <w:tc>
+          <w:tcPr>
+            <w:tcW w:type="dxa" w:w="2600"/>
+            <w:shd w:fill="F2F2F2" w:val="clear"/>
+            <w:tcMar>
+              <w:top w:type="dxa" w:w="70"/>
+              <w:left w:type="dxa" w:w="110"/>
+              <w:bottom w:type="dxa" w:w="70"/>
+              <w:right w:type="dxa" w:w="110"/>
+            </w:tcMar>
+            <w:vAlign w:val="center"/>
+          </w:tcPr>
+          <w:p>
+            <w:pPr>
+              <w:spacing w:after="0"/>
+            </w:pPr>
+            <w:r>
+              <w:rPr>
+                <w:b w:val="false"/>
+                <w:bCs w:val="false"/>
+                <w:sz w:val="19"/>
+                <w:szCs w:val="19"/>
+              </w:rPr>
               <w:t xml:space="preserve">TSE — resultados</w:t>
             </w:r>
           </w:p>
@@ -5667,7 +5753,7 @@
         <w:tc>
           <w:tcPr>
             <w:tcW w:type="dxa" w:w="4600"/>
-            <w:shd w:fill="FFFFFF" w:val="clear"/>
+            <w:shd w:fill="F2F2F2" w:val="clear"/>
             <w:tcMar>
               <w:top w:type="dxa" w:w="70"/>
               <w:left w:type="dxa" w:w="110"/>
@@ -5694,7 +5780,7 @@
         <w:tc>
           <w:tcPr>
             <w:tcW w:type="dxa" w:w="2400"/>
-            <w:shd w:fill="FFFFFF" w:val="clear"/>
+            <w:shd w:fill="F2F2F2" w:val="clear"/>
             <w:tcMar>
               <w:top w:type="dxa" w:w="70"/>
               <w:left w:type="dxa" w:w="110"/>
@@ -5726,7 +5812,7 @@
         <w:tc>
           <w:tcPr>
             <w:tcW w:type="dxa" w:w="2600"/>
-            <w:shd w:fill="F2F2F2" w:val="clear"/>
+            <w:shd w:fill="FFFFFF" w:val="clear"/>
             <w:tcMar>
               <w:top w:type="dxa" w:w="70"/>
               <w:left w:type="dxa" w:w="110"/>
@@ -5753,7 +5839,7 @@
         <w:tc>
           <w:tcPr>
             <w:tcW w:type="dxa" w:w="4600"/>
-            <w:shd w:fill="F2F2F2" w:val="clear"/>
+            <w:shd w:fill="FFFFFF" w:val="clear"/>
             <w:tcMar>
               <w:top w:type="dxa" w:w="70"/>
               <w:left w:type="dxa" w:w="110"/>
@@ -5780,7 +5866,7 @@
         <w:tc>
           <w:tcPr>
             <w:tcW w:type="dxa" w:w="2400"/>
-            <w:shd w:fill="F2F2F2" w:val="clear"/>
+            <w:shd w:fill="FFFFFF" w:val="clear"/>
             <w:tcMar>
               <w:top w:type="dxa" w:w="70"/>
               <w:left w:type="dxa" w:w="110"/>
@@ -5812,7 +5898,7 @@
         <w:tc>
           <w:tcPr>
             <w:tcW w:type="dxa" w:w="2600"/>
-            <w:shd w:fill="FFFFFF" w:val="clear"/>
+            <w:shd w:fill="F2F2F2" w:val="clear"/>
             <w:tcMar>
               <w:top w:type="dxa" w:w="70"/>
               <w:left w:type="dxa" w:w="110"/>
@@ -5839,7 +5925,7 @@
         <w:tc>
           <w:tcPr>
             <w:tcW w:type="dxa" w:w="4600"/>
-            <w:shd w:fill="FFFFFF" w:val="clear"/>
+            <w:shd w:fill="F2F2F2" w:val="clear"/>
             <w:tcMar>
               <w:top w:type="dxa" w:w="70"/>
               <w:left w:type="dxa" w:w="110"/>
@@ -5866,7 +5952,7 @@
         <w:tc>
           <w:tcPr>
             <w:tcW w:type="dxa" w:w="2400"/>
-            <w:shd w:fill="FFFFFF" w:val="clear"/>
+            <w:shd w:fill="F2F2F2" w:val="clear"/>
             <w:tcMar>
               <w:top w:type="dxa" w:w="70"/>
               <w:left w:type="dxa" w:w="110"/>
@@ -5898,7 +5984,7 @@
         <w:tc>
           <w:tcPr>
             <w:tcW w:type="dxa" w:w="2600"/>
-            <w:shd w:fill="F2F2F2" w:val="clear"/>
+            <w:shd w:fill="FFFFFF" w:val="clear"/>
             <w:tcMar>
               <w:top w:type="dxa" w:w="70"/>
               <w:left w:type="dxa" w:w="110"/>
@@ -5925,7 +6011,7 @@
         <w:tc>
           <w:tcPr>
             <w:tcW w:type="dxa" w:w="4600"/>
-            <w:shd w:fill="F2F2F2" w:val="clear"/>
+            <w:shd w:fill="FFFFFF" w:val="clear"/>
             <w:tcMar>
               <w:top w:type="dxa" w:w="70"/>
               <w:left w:type="dxa" w:w="110"/>
@@ -5952,7 +6038,7 @@
         <w:tc>
           <w:tcPr>
             <w:tcW w:type="dxa" w:w="2400"/>
-            <w:shd w:fill="F2F2F2" w:val="clear"/>
+            <w:shd w:fill="FFFFFF" w:val="clear"/>
             <w:tcMar>
               <w:top w:type="dxa" w:w="70"/>
               <w:left w:type="dxa" w:w="110"/>
@@ -5984,7 +6070,7 @@
         <w:tc>
           <w:tcPr>
             <w:tcW w:type="dxa" w:w="2600"/>
-            <w:shd w:fill="FFFFFF" w:val="clear"/>
+            <w:shd w:fill="F2F2F2" w:val="clear"/>
             <w:tcMar>
               <w:top w:type="dxa" w:w="70"/>
               <w:left w:type="dxa" w:w="110"/>
@@ -6011,7 +6097,7 @@
         <w:tc>
           <w:tcPr>
             <w:tcW w:type="dxa" w:w="4600"/>
-            <w:shd w:fill="FFFFFF" w:val="clear"/>
+            <w:shd w:fill="F2F2F2" w:val="clear"/>
             <w:tcMar>
               <w:top w:type="dxa" w:w="70"/>
               <w:left w:type="dxa" w:w="110"/>
@@ -6038,7 +6124,7 @@
         <w:tc>
           <w:tcPr>
             <w:tcW w:type="dxa" w:w="2400"/>
-            <w:shd w:fill="FFFFFF" w:val="clear"/>
+            <w:shd w:fill="F2F2F2" w:val="clear"/>
             <w:tcMar>
               <w:top w:type="dxa" w:w="70"/>
               <w:left w:type="dxa" w:w="110"/>

</xml_diff>

<commit_message>
Economia: releases oficiais do IBGE ao lado do IPCA, do INPC e do PIB (ADR-033, adendo)
Os indicadores do IBGE (e os derivados de uma série só, como o IPCA em 12
meses) mostram os três releases mais recentes da Agência de Notícias, com
título, data e link, pela API pública de notícias do IBGE (tipo=release,
idproduto). Os releases entram no estado da coleta diária da Economia; falha
neles não derruba a coleta das séries. O adendo registra também por que
notícias de jornal ficam de fora: vinculação errada por nome parecido,
imputação vedada pelo DOC-08 e termos de uso.

Teste de contrato novo da API de notícias. O do SGS passa a pular, com o
motivo, quando o Banco Central responde 5xx ou uma página no lugar do JSON
(17 e 18/10/2026): é acesso, não mudança de formato (RF-CO-14). DOC-06 1.5 e
DOC-11 regerados.
</commit_message>
<xml_diff>
--- a/docs/DOC-06_Catalogo_de_Fontes.docx
+++ b/docs/DOC-06_Catalogo_de_Fontes.docx
@@ -267,7 +267,7 @@
                 <w:sz w:val="19"/>
                 <w:szCs w:val="19"/>
               </w:rPr>
-              <w:t xml:space="preserve">1.4</w:t>
+              <w:t xml:space="preserve">1.5</w:t>
             </w:r>
           </w:p>
         </w:tc>
@@ -326,7 +326,7 @@
                 <w:sz w:val="19"/>
                 <w:szCs w:val="19"/>
               </w:rPr>
-              <w:t xml:space="preserve">16 de outubro de 2026</w:t>
+              <w:t xml:space="preserve">20 de outubro de 2026</w:t>
             </w:r>
           </w:p>
         </w:tc>
@@ -425,9 +425,11 @@
         <w:keepLines/>
         <w:spacing w:after="160" w:before="380"/>
       </w:pPr>
+      <w:bookmarkStart w:name="_Toc1" w:id="1"/>
       <w:r>
         <w:t xml:space="preserve">Sumário</w:t>
       </w:r>
+      <w:bookmarkEnd w:id="1"/>
     </w:p>
     <w:p>
       <w:pPr>
@@ -452,11 +454,529 @@
       </w:sdtPr>
       <w:sdtContent>
         <w:p>
+          <w:pPr>
+            <w:pStyle w:val="TOC1"/>
+            <w:tabs>
+              <w:tab w:val="right" w:pos="9638" w:leader="dot"/>
+            </w:tabs>
+          </w:pPr>
           <w:r>
             <w:fldChar w:fldCharType="begin" w:dirty="true"/>
             <w:instrText xml:space="preserve">TOC \h \o "1-3"</w:instrText>
             <w:fldChar w:fldCharType="separate"/>
           </w:r>
+          <w:hyperlink w:history="1" w:anchor="_Toc1">
+            <w:r>
+              <w:t xml:space="preserve">Sumário</w:t>
+            </w:r>
+            <w:r>
+              <w:tab/>
+            </w:r>
+            <w:r>
+              <w:fldChar w:fldCharType="begin" w:dirty="true"/>
+              <w:instrText xml:space="preserve">PAGEREF _Toc1 \h</w:instrText>
+              <w:fldChar w:fldCharType="separate"/>
+              <w:fldChar w:fldCharType="end"/>
+            </w:r>
+          </w:hyperlink>
+        </w:p>
+        <w:p>
+          <w:pPr>
+            <w:pStyle w:val="TOC1"/>
+            <w:tabs>
+              <w:tab w:val="right" w:pos="9638" w:leader="dot"/>
+            </w:tabs>
+          </w:pPr>
+          <w:hyperlink w:history="1" w:anchor="_Toc2">
+            <w:r>
+              <w:t xml:space="preserve">1. Estratégia de cobertura</w:t>
+            </w:r>
+            <w:r>
+              <w:tab/>
+            </w:r>
+            <w:r>
+              <w:fldChar w:fldCharType="begin" w:dirty="true"/>
+              <w:instrText xml:space="preserve">PAGEREF _Toc2 \h</w:instrText>
+              <w:fldChar w:fldCharType="separate"/>
+              <w:fldChar w:fldCharType="end"/>
+            </w:r>
+          </w:hyperlink>
+        </w:p>
+        <w:p>
+          <w:pPr>
+            <w:pStyle w:val="TOC1"/>
+            <w:tabs>
+              <w:tab w:val="right" w:pos="9638" w:leader="dot"/>
+            </w:tabs>
+          </w:pPr>
+          <w:hyperlink w:history="1" w:anchor="_Toc3">
+            <w:r>
+              <w:t xml:space="preserve">2. Camada 1 — Fontes federais estruturadas</w:t>
+            </w:r>
+            <w:r>
+              <w:tab/>
+            </w:r>
+            <w:r>
+              <w:fldChar w:fldCharType="begin" w:dirty="true"/>
+              <w:instrText xml:space="preserve">PAGEREF _Toc3 \h</w:instrText>
+              <w:fldChar w:fldCharType="separate"/>
+              <w:fldChar w:fldCharType="end"/>
+            </w:r>
+          </w:hyperlink>
+        </w:p>
+        <w:p>
+          <w:pPr>
+            <w:pStyle w:val="TOC2"/>
+            <w:tabs>
+              <w:tab w:val="right" w:pos="9638" w:leader="dot"/>
+            </w:tabs>
+            <w:ind w:left="220"/>
+          </w:pPr>
+          <w:hyperlink w:history="1" w:anchor="_Toc4">
+            <w:r>
+              <w:t xml:space="preserve">2.1 PNCP — Portal Nacional de Contratações Públicas</w:t>
+            </w:r>
+            <w:r>
+              <w:tab/>
+            </w:r>
+            <w:r>
+              <w:fldChar w:fldCharType="begin" w:dirty="true"/>
+              <w:instrText xml:space="preserve">PAGEREF _Toc4 \h</w:instrText>
+              <w:fldChar w:fldCharType="separate"/>
+              <w:fldChar w:fldCharType="end"/>
+            </w:r>
+          </w:hyperlink>
+        </w:p>
+        <w:p>
+          <w:pPr>
+            <w:pStyle w:val="TOC3"/>
+            <w:tabs>
+              <w:tab w:val="right" w:pos="9638" w:leader="dot"/>
+            </w:tabs>
+            <w:ind w:left="440"/>
+          </w:pPr>
+          <w:hyperlink w:history="1" w:anchor="_Toc5">
+            <w:r>
+              <w:t xml:space="preserve">Recursos relevantes</w:t>
+            </w:r>
+            <w:r>
+              <w:tab/>
+            </w:r>
+            <w:r>
+              <w:fldChar w:fldCharType="begin" w:dirty="true"/>
+              <w:instrText xml:space="preserve">PAGEREF _Toc5 \h</w:instrText>
+              <w:fldChar w:fldCharType="separate"/>
+              <w:fldChar w:fldCharType="end"/>
+            </w:r>
+          </w:hyperlink>
+        </w:p>
+        <w:p>
+          <w:pPr>
+            <w:pStyle w:val="TOC3"/>
+            <w:tabs>
+              <w:tab w:val="right" w:pos="9638" w:leader="dot"/>
+            </w:tabs>
+            <w:ind w:left="440"/>
+          </w:pPr>
+          <w:hyperlink w:history="1" w:anchor="_Toc6">
+            <w:r>
+              <w:t xml:space="preserve">Comportamento real observado (outubro de 2026)</w:t>
+            </w:r>
+            <w:r>
+              <w:tab/>
+            </w:r>
+            <w:r>
+              <w:fldChar w:fldCharType="begin" w:dirty="true"/>
+              <w:instrText xml:space="preserve">PAGEREF _Toc6 \h</w:instrText>
+              <w:fldChar w:fldCharType="separate"/>
+              <w:fldChar w:fldCharType="end"/>
+            </w:r>
+          </w:hyperlink>
+        </w:p>
+        <w:p>
+          <w:pPr>
+            <w:pStyle w:val="TOC2"/>
+            <w:tabs>
+              <w:tab w:val="right" w:pos="9638" w:leader="dot"/>
+            </w:tabs>
+            <w:ind w:left="220"/>
+          </w:pPr>
+          <w:hyperlink w:history="1" w:anchor="_Toc7">
+            <w:r>
+              <w:t xml:space="preserve">2.2 SICONFI — Tesouro Nacional</w:t>
+            </w:r>
+            <w:r>
+              <w:tab/>
+            </w:r>
+            <w:r>
+              <w:fldChar w:fldCharType="begin" w:dirty="true"/>
+              <w:instrText xml:space="preserve">PAGEREF _Toc7 \h</w:instrText>
+              <w:fldChar w:fldCharType="separate"/>
+              <w:fldChar w:fldCharType="end"/>
+            </w:r>
+          </w:hyperlink>
+        </w:p>
+        <w:p>
+          <w:pPr>
+            <w:pStyle w:val="TOC3"/>
+            <w:tabs>
+              <w:tab w:val="right" w:pos="9638" w:leader="dot"/>
+            </w:tabs>
+            <w:ind w:left="440"/>
+          </w:pPr>
+          <w:hyperlink w:history="1" w:anchor="_Toc8">
+            <w:r>
+              <w:t xml:space="preserve">Comportamento real observado (outubro de 2026)</w:t>
+            </w:r>
+            <w:r>
+              <w:tab/>
+            </w:r>
+            <w:r>
+              <w:fldChar w:fldCharType="begin" w:dirty="true"/>
+              <w:instrText xml:space="preserve">PAGEREF _Toc8 \h</w:instrText>
+              <w:fldChar w:fldCharType="separate"/>
+              <w:fldChar w:fldCharType="end"/>
+            </w:r>
+          </w:hyperlink>
+        </w:p>
+        <w:p>
+          <w:pPr>
+            <w:pStyle w:val="TOC2"/>
+            <w:tabs>
+              <w:tab w:val="right" w:pos="9638" w:leader="dot"/>
+            </w:tabs>
+            <w:ind w:left="220"/>
+          </w:pPr>
+          <w:hyperlink w:history="1" w:anchor="_Toc9">
+            <w:r>
+              <w:t xml:space="preserve">2.3 Portal da Transparência — CGU</w:t>
+            </w:r>
+            <w:r>
+              <w:tab/>
+            </w:r>
+            <w:r>
+              <w:fldChar w:fldCharType="begin" w:dirty="true"/>
+              <w:instrText xml:space="preserve">PAGEREF _Toc9 \h</w:instrText>
+              <w:fldChar w:fldCharType="separate"/>
+              <w:fldChar w:fldCharType="end"/>
+            </w:r>
+          </w:hyperlink>
+        </w:p>
+        <w:p>
+          <w:pPr>
+            <w:pStyle w:val="TOC2"/>
+            <w:tabs>
+              <w:tab w:val="right" w:pos="9638" w:leader="dot"/>
+            </w:tabs>
+            <w:ind w:left="220"/>
+          </w:pPr>
+          <w:hyperlink w:history="1" w:anchor="_Toc10">
+            <w:r>
+              <w:t xml:space="preserve">2.4 Receita Federal — base pública de CNPJ</w:t>
+            </w:r>
+            <w:r>
+              <w:tab/>
+            </w:r>
+            <w:r>
+              <w:fldChar w:fldCharType="begin" w:dirty="true"/>
+              <w:instrText xml:space="preserve">PAGEREF _Toc10 \h</w:instrText>
+              <w:fldChar w:fldCharType="separate"/>
+              <w:fldChar w:fldCharType="end"/>
+            </w:r>
+          </w:hyperlink>
+        </w:p>
+        <w:p>
+          <w:pPr>
+            <w:pStyle w:val="TOC2"/>
+            <w:tabs>
+              <w:tab w:val="right" w:pos="9638" w:leader="dot"/>
+            </w:tabs>
+            <w:ind w:left="220"/>
+          </w:pPr>
+          <w:hyperlink w:history="1" w:anchor="_Toc11">
+            <w:r>
+              <w:t xml:space="preserve">2.5 Demais fontes federais</w:t>
+            </w:r>
+            <w:r>
+              <w:tab/>
+            </w:r>
+            <w:r>
+              <w:fldChar w:fldCharType="begin" w:dirty="true"/>
+              <w:instrText xml:space="preserve">PAGEREF _Toc11 \h</w:instrText>
+              <w:fldChar w:fldCharType="separate"/>
+              <w:fldChar w:fldCharType="end"/>
+            </w:r>
+          </w:hyperlink>
+        </w:p>
+        <w:p>
+          <w:pPr>
+            <w:pStyle w:val="TOC2"/>
+            <w:tabs>
+              <w:tab w:val="right" w:pos="9638" w:leader="dot"/>
+            </w:tabs>
+            <w:ind w:left="220"/>
+          </w:pPr>
+          <w:hyperlink w:history="1" w:anchor="_Toc12">
+            <w:r>
+              <w:t xml:space="preserve">2.6 TSE — resultados eleitorais (aba Eleições)</w:t>
+            </w:r>
+            <w:r>
+              <w:tab/>
+            </w:r>
+            <w:r>
+              <w:fldChar w:fldCharType="begin" w:dirty="true"/>
+              <w:instrText xml:space="preserve">PAGEREF _Toc12 \h</w:instrText>
+              <w:fldChar w:fldCharType="separate"/>
+              <w:fldChar w:fldCharType="end"/>
+            </w:r>
+          </w:hyperlink>
+        </w:p>
+        <w:p>
+          <w:pPr>
+            <w:pStyle w:val="TOC2"/>
+            <w:tabs>
+              <w:tab w:val="right" w:pos="9638" w:leader="dot"/>
+            </w:tabs>
+            <w:ind w:left="220"/>
+          </w:pPr>
+          <w:hyperlink w:history="1" w:anchor="_Toc13">
+            <w:r>
+              <w:t xml:space="preserve">2.7 IBGE — localidades, população e malhas</w:t>
+            </w:r>
+            <w:r>
+              <w:tab/>
+            </w:r>
+            <w:r>
+              <w:fldChar w:fldCharType="begin" w:dirty="true"/>
+              <w:instrText xml:space="preserve">PAGEREF _Toc13 \h</w:instrText>
+              <w:fldChar w:fldCharType="separate"/>
+              <w:fldChar w:fldCharType="end"/>
+            </w:r>
+          </w:hyperlink>
+        </w:p>
+        <w:p>
+          <w:pPr>
+            <w:pStyle w:val="TOC2"/>
+            <w:tabs>
+              <w:tab w:val="right" w:pos="9638" w:leader="dot"/>
+            </w:tabs>
+            <w:ind w:left="220"/>
+          </w:pPr>
+          <w:hyperlink w:history="1" w:anchor="_Toc14">
+            <w:r>
+              <w:t xml:space="preserve">2.8 Referência de mercado de fora do governo (regra A-05)</w:t>
+            </w:r>
+            <w:r>
+              <w:tab/>
+            </w:r>
+            <w:r>
+              <w:fldChar w:fldCharType="begin" w:dirty="true"/>
+              <w:instrText xml:space="preserve">PAGEREF _Toc14 \h</w:instrText>
+              <w:fldChar w:fldCharType="separate"/>
+              <w:fldChar w:fldCharType="end"/>
+            </w:r>
+          </w:hyperlink>
+        </w:p>
+        <w:p>
+          <w:pPr>
+            <w:pStyle w:val="TOC1"/>
+            <w:tabs>
+              <w:tab w:val="right" w:pos="9638" w:leader="dot"/>
+            </w:tabs>
+          </w:pPr>
+          <w:hyperlink w:history="1" w:anchor="_Toc15">
+            <w:r>
+              <w:t xml:space="preserve">3. Camada 2 — Estados e tribunais de contas</w:t>
+            </w:r>
+            <w:r>
+              <w:tab/>
+            </w:r>
+            <w:r>
+              <w:fldChar w:fldCharType="begin" w:dirty="true"/>
+              <w:instrText xml:space="preserve">PAGEREF _Toc15 \h</w:instrText>
+              <w:fldChar w:fldCharType="separate"/>
+              <w:fldChar w:fldCharType="end"/>
+            </w:r>
+          </w:hyperlink>
+        </w:p>
+        <w:p>
+          <w:pPr>
+            <w:pStyle w:val="TOC1"/>
+            <w:tabs>
+              <w:tab w:val="right" w:pos="9638" w:leader="dot"/>
+            </w:tabs>
+          </w:pPr>
+          <w:hyperlink w:history="1" w:anchor="_Toc16">
+            <w:r>
+              <w:t xml:space="preserve">4. Camada 3 — Municípios</w:t>
+            </w:r>
+            <w:r>
+              <w:tab/>
+            </w:r>
+            <w:r>
+              <w:fldChar w:fldCharType="begin" w:dirty="true"/>
+              <w:instrText xml:space="preserve">PAGEREF _Toc16 \h</w:instrText>
+              <w:fldChar w:fldCharType="separate"/>
+              <w:fldChar w:fldCharType="end"/>
+            </w:r>
+          </w:hyperlink>
+        </w:p>
+        <w:p>
+          <w:pPr>
+            <w:pStyle w:val="TOC2"/>
+            <w:tabs>
+              <w:tab w:val="right" w:pos="9638" w:leader="dot"/>
+            </w:tabs>
+            <w:ind w:left="220"/>
+          </w:pPr>
+          <w:hyperlink w:history="1" w:anchor="_Toc17">
+            <w:r>
+              <w:t xml:space="preserve">4.1 Abordagem por família de plataforma</w:t>
+            </w:r>
+            <w:r>
+              <w:tab/>
+            </w:r>
+            <w:r>
+              <w:fldChar w:fldCharType="begin" w:dirty="true"/>
+              <w:instrText xml:space="preserve">PAGEREF _Toc17 \h</w:instrText>
+              <w:fldChar w:fldCharType="separate"/>
+              <w:fldChar w:fldCharType="end"/>
+            </w:r>
+          </w:hyperlink>
+        </w:p>
+        <w:p>
+          <w:pPr>
+            <w:pStyle w:val="TOC2"/>
+            <w:tabs>
+              <w:tab w:val="right" w:pos="9638" w:leader="dot"/>
+            </w:tabs>
+            <w:ind w:left="220"/>
+          </w:pPr>
+          <w:hyperlink w:history="1" w:anchor="_Toc18">
+            <w:r>
+              <w:t xml:space="preserve">4.2 Cauda longa</w:t>
+            </w:r>
+            <w:r>
+              <w:tab/>
+            </w:r>
+            <w:r>
+              <w:fldChar w:fldCharType="begin" w:dirty="true"/>
+              <w:instrText xml:space="preserve">PAGEREF _Toc18 \h</w:instrText>
+              <w:fldChar w:fldCharType="separate"/>
+              <w:fldChar w:fldCharType="end"/>
+            </w:r>
+          </w:hyperlink>
+        </w:p>
+        <w:p>
+          <w:pPr>
+            <w:pStyle w:val="TOC2"/>
+            <w:tabs>
+              <w:tab w:val="right" w:pos="9638" w:leader="dot"/>
+            </w:tabs>
+            <w:ind w:left="220"/>
+          </w:pPr>
+          <w:hyperlink w:history="1" w:anchor="_Toc19">
+            <w:r>
+              <w:t xml:space="preserve">4.3 Especificação declarativa de fonte</w:t>
+            </w:r>
+            <w:r>
+              <w:tab/>
+            </w:r>
+            <w:r>
+              <w:fldChar w:fldCharType="begin" w:dirty="true"/>
+              <w:instrText xml:space="preserve">PAGEREF _Toc19 \h</w:instrText>
+              <w:fldChar w:fldCharType="separate"/>
+              <w:fldChar w:fldCharType="end"/>
+            </w:r>
+          </w:hyperlink>
+        </w:p>
+        <w:p>
+          <w:pPr>
+            <w:pStyle w:val="TOC1"/>
+            <w:tabs>
+              <w:tab w:val="right" w:pos="9638" w:leader="dot"/>
+            </w:tabs>
+          </w:pPr>
+          <w:hyperlink w:history="1" w:anchor="_Toc20">
+            <w:r>
+              <w:t xml:space="preserve">5. Política de coleta responsável</w:t>
+            </w:r>
+            <w:r>
+              <w:tab/>
+            </w:r>
+            <w:r>
+              <w:fldChar w:fldCharType="begin" w:dirty="true"/>
+              <w:instrText xml:space="preserve">PAGEREF _Toc20 \h</w:instrText>
+              <w:fldChar w:fldCharType="separate"/>
+              <w:fldChar w:fldCharType="end"/>
+            </w:r>
+          </w:hyperlink>
+        </w:p>
+        <w:p>
+          <w:pPr>
+            <w:pStyle w:val="TOC1"/>
+            <w:tabs>
+              <w:tab w:val="right" w:pos="9638" w:leader="dot"/>
+            </w:tabs>
+          </w:pPr>
+          <w:hyperlink w:history="1" w:anchor="_Toc21">
+            <w:r>
+              <w:t xml:space="preserve">6. Matriz de cobertura esperada por fase</w:t>
+            </w:r>
+            <w:r>
+              <w:tab/>
+            </w:r>
+            <w:r>
+              <w:fldChar w:fldCharType="begin" w:dirty="true"/>
+              <w:instrText xml:space="preserve">PAGEREF _Toc21 \h</w:instrText>
+              <w:fldChar w:fldCharType="separate"/>
+              <w:fldChar w:fldCharType="end"/>
+            </w:r>
+          </w:hyperlink>
+        </w:p>
+        <w:p>
+          <w:pPr>
+            <w:pStyle w:val="TOC1"/>
+            <w:tabs>
+              <w:tab w:val="right" w:pos="9638" w:leader="dot"/>
+            </w:tabs>
+          </w:pPr>
+          <w:hyperlink w:history="1" w:anchor="_Toc22">
+            <w:r>
+              <w:t xml:space="preserve">7. Situação da integração (outubro de 2026)</w:t>
+            </w:r>
+            <w:r>
+              <w:tab/>
+            </w:r>
+            <w:r>
+              <w:fldChar w:fldCharType="begin" w:dirty="true"/>
+              <w:instrText xml:space="preserve">PAGEREF _Toc22 \h</w:instrText>
+              <w:fldChar w:fldCharType="separate"/>
+              <w:fldChar w:fldCharType="end"/>
+            </w:r>
+          </w:hyperlink>
+        </w:p>
+        <w:p>
+          <w:pPr>
+            <w:pStyle w:val="TOC1"/>
+            <w:tabs>
+              <w:tab w:val="right" w:pos="9638" w:leader="dot"/>
+            </w:tabs>
+          </w:pPr>
+          <w:hyperlink w:history="1" w:anchor="_Toc23">
+            <w:r>
+              <w:t xml:space="preserve">8. Registro de fontes</w:t>
+            </w:r>
+            <w:r>
+              <w:tab/>
+            </w:r>
+            <w:r>
+              <w:fldChar w:fldCharType="begin" w:dirty="true"/>
+              <w:instrText xml:space="preserve">PAGEREF _Toc23 \h</w:instrText>
+              <w:fldChar w:fldCharType="separate"/>
+              <w:fldChar w:fldCharType="end"/>
+            </w:r>
+          </w:hyperlink>
         </w:p>
         <w:p>
           <w:r>
@@ -477,9 +997,11 @@
         <w:keepLines/>
         <w:spacing w:after="160" w:before="380"/>
       </w:pPr>
+      <w:bookmarkStart w:name="_Toc2" w:id="2"/>
       <w:r>
         <w:t xml:space="preserve">1. Estratégia de cobertura</w:t>
       </w:r>
+      <w:bookmarkEnd w:id="2"/>
     </w:p>
     <w:p>
       <w:pPr>
@@ -608,9 +1130,11 @@
         <w:keepLines/>
         <w:spacing w:after="160" w:before="380"/>
       </w:pPr>
+      <w:bookmarkStart w:name="_Toc3" w:id="3"/>
       <w:r>
         <w:t xml:space="preserve">2. Camada 1 — Fontes federais estruturadas</w:t>
       </w:r>
+      <w:bookmarkEnd w:id="3"/>
     </w:p>
     <w:p>
       <w:pPr>
@@ -619,9 +1143,11 @@
         <w:keepLines/>
         <w:spacing w:after="120" w:before="280"/>
       </w:pPr>
+      <w:bookmarkStart w:name="_Toc4" w:id="4"/>
       <w:r>
         <w:t xml:space="preserve">2.1 PNCP — Portal Nacional de Contratações Públicas</w:t>
       </w:r>
+      <w:bookmarkEnd w:id="4"/>
     </w:p>
     <w:tbl>
       <w:tblPr>
@@ -1060,9 +1586,11 @@
         <w:keepLines/>
         <w:spacing w:after="100" w:before="220"/>
       </w:pPr>
+      <w:bookmarkStart w:name="_Toc5" w:id="5"/>
       <w:r>
         <w:t xml:space="preserve">Recursos relevantes</w:t>
       </w:r>
+      <w:bookmarkEnd w:id="5"/>
     </w:p>
     <w:tbl>
       <w:tblPr>
@@ -1866,9 +2394,11 @@
         <w:keepLines/>
         <w:spacing w:after="100" w:before="220"/>
       </w:pPr>
+      <w:bookmarkStart w:name="_Toc6" w:id="6"/>
       <w:r>
         <w:t xml:space="preserve">Comportamento real observado (outubro de 2026)</w:t>
       </w:r>
+      <w:bookmarkEnd w:id="6"/>
     </w:p>
     <w:p>
       <w:pPr>
@@ -2804,9 +3334,11 @@
         <w:keepLines/>
         <w:spacing w:after="120" w:before="280"/>
       </w:pPr>
+      <w:bookmarkStart w:name="_Toc7" w:id="7"/>
       <w:r>
         <w:t xml:space="preserve">2.2 SICONFI — Tesouro Nacional</w:t>
       </w:r>
+      <w:bookmarkEnd w:id="7"/>
     </w:p>
     <w:tbl>
       <w:tblPr>
@@ -3259,9 +3791,11 @@
         <w:keepLines/>
         <w:spacing w:after="100" w:before="220"/>
       </w:pPr>
+      <w:bookmarkStart w:name="_Toc8" w:id="8"/>
       <w:r>
         <w:t xml:space="preserve">Comportamento real observado (outubro de 2026)</w:t>
       </w:r>
+      <w:bookmarkEnd w:id="8"/>
     </w:p>
     <w:tbl>
       <w:tblPr>
@@ -3711,9 +4245,11 @@
         <w:keepLines/>
         <w:spacing w:after="120" w:before="280"/>
       </w:pPr>
+      <w:bookmarkStart w:name="_Toc9" w:id="9"/>
       <w:r>
         <w:t xml:space="preserve">2.3 Portal da Transparência — CGU</w:t>
       </w:r>
+      <w:bookmarkEnd w:id="9"/>
     </w:p>
     <w:tbl>
       <w:tblPr>
@@ -4961,9 +5497,11 @@
         <w:keepLines/>
         <w:spacing w:after="120" w:before="280"/>
       </w:pPr>
+      <w:bookmarkStart w:name="_Toc10" w:id="10"/>
       <w:r>
         <w:t xml:space="preserve">2.4 Receita Federal — base pública de CNPJ</w:t>
       </w:r>
+      <w:bookmarkEnd w:id="10"/>
     </w:p>
     <w:p>
       <w:pPr>
@@ -5351,9 +5889,11 @@
         <w:keepLines/>
         <w:spacing w:after="120" w:before="280"/>
       </w:pPr>
+      <w:bookmarkStart w:name="_Toc11" w:id="11"/>
       <w:r>
         <w:t xml:space="preserve">2.5 Demais fontes federais</w:t>
       </w:r>
+      <w:bookmarkEnd w:id="11"/>
     </w:p>
     <w:tbl>
       <w:tblPr>
@@ -6211,9 +6751,11 @@
         <w:keepLines/>
         <w:spacing w:after="120" w:before="280"/>
       </w:pPr>
+      <w:bookmarkStart w:name="_Toc12" w:id="12"/>
       <w:r>
         <w:t xml:space="preserve">2.6 TSE — resultados eleitorais (aba Eleições)</w:t>
       </w:r>
+      <w:bookmarkEnd w:id="12"/>
     </w:p>
     <w:p>
       <w:pPr>
@@ -6629,9 +7171,11 @@
         <w:keepLines/>
         <w:spacing w:after="120" w:before="280"/>
       </w:pPr>
+      <w:bookmarkStart w:name="_Toc13" w:id="13"/>
       <w:r>
         <w:t xml:space="preserve">2.7 IBGE — localidades, população e malhas</w:t>
       </w:r>
+      <w:bookmarkEnd w:id="13"/>
     </w:p>
     <w:tbl>
       <w:tblPr>
@@ -6993,6 +7537,92 @@
                 <w:szCs w:val="17"/>
               </w:rPr>
               <w:t xml:space="preserve">Mapa da aba Eleições; código IBGE em codarea</w:t>
+            </w:r>
+          </w:p>
+        </w:tc>
+      </w:tr>
+      <w:tr>
+        <w:trPr>
+          <w:cantSplit/>
+        </w:trPr>
+        <w:tc>
+          <w:tcPr>
+            <w:tcW w:type="dxa" w:w="2200"/>
+            <w:shd w:fill="F2F2F2" w:val="clear"/>
+            <w:tcMar>
+              <w:top w:type="dxa" w:w="70"/>
+              <w:left w:type="dxa" w:w="110"/>
+              <w:bottom w:type="dxa" w:w="70"/>
+              <w:right w:type="dxa" w:w="110"/>
+            </w:tcMar>
+            <w:vAlign w:val="center"/>
+          </w:tcPr>
+          <w:p>
+            <w:pPr>
+              <w:spacing w:after="0"/>
+            </w:pPr>
+            <w:r>
+              <w:rPr>
+                <w:b w:val="false"/>
+                <w:bCs w:val="false"/>
+                <w:sz w:val="17"/>
+                <w:szCs w:val="17"/>
+              </w:rPr>
+              <w:t xml:space="preserve">Notícias v3 (releases)</w:t>
+            </w:r>
+          </w:p>
+        </w:tc>
+        <w:tc>
+          <w:tcPr>
+            <w:tcW w:type="dxa" w:w="4400"/>
+            <w:shd w:fill="F2F2F2" w:val="clear"/>
+            <w:tcMar>
+              <w:top w:type="dxa" w:w="70"/>
+              <w:left w:type="dxa" w:w="110"/>
+              <w:bottom w:type="dxa" w:w="70"/>
+              <w:right w:type="dxa" w:w="110"/>
+            </w:tcMar>
+            <w:vAlign w:val="center"/>
+          </w:tcPr>
+          <w:p>
+            <w:pPr>
+              <w:spacing w:after="0"/>
+            </w:pPr>
+            <w:r>
+              <w:rPr>
+                <w:b w:val="false"/>
+                <w:bCs w:val="false"/>
+                <w:sz w:val="17"/>
+                <w:szCs w:val="17"/>
+              </w:rPr>
+              <w:t xml:space="preserve">servicodados.ibge.gov.br/api/v3/noticias, tipo=release e idproduto</w:t>
+            </w:r>
+          </w:p>
+        </w:tc>
+        <w:tc>
+          <w:tcPr>
+            <w:tcW w:type="dxa" w:w="3000"/>
+            <w:shd w:fill="F2F2F2" w:val="clear"/>
+            <w:tcMar>
+              <w:top w:type="dxa" w:w="70"/>
+              <w:left w:type="dxa" w:w="110"/>
+              <w:bottom w:type="dxa" w:w="70"/>
+              <w:right w:type="dxa" w:w="110"/>
+            </w:tcMar>
+            <w:vAlign w:val="center"/>
+          </w:tcPr>
+          <w:p>
+            <w:pPr>
+              <w:spacing w:after="0"/>
+            </w:pPr>
+            <w:r>
+              <w:rPr>
+                <w:b w:val="false"/>
+                <w:bCs w:val="false"/>
+                <w:sz w:val="17"/>
+                <w:szCs w:val="17"/>
+              </w:rPr>
+              <w:t xml:space="preserve">Releases da Agência de Notícias ao lado do IPCA, do INPC e do PIB na área Economia (ADR-033, adendo de 20/10/2026); data como dd/mm/aaaa hh:mm:ss e link em http</w:t>
             </w:r>
           </w:p>
         </w:tc>
@@ -7019,9 +7649,11 @@
         <w:keepLines/>
         <w:spacing w:after="120" w:before="280"/>
       </w:pPr>
+      <w:bookmarkStart w:name="_Toc14" w:id="14"/>
       <w:r>
         <w:t xml:space="preserve">2.8 Referência de mercado de fora do governo (regra A-05)</w:t>
       </w:r>
+      <w:bookmarkEnd w:id="14"/>
     </w:p>
     <w:p>
       <w:pPr>
@@ -7614,9 +8246,11 @@
         <w:keepLines/>
         <w:spacing w:after="160" w:before="380"/>
       </w:pPr>
+      <w:bookmarkStart w:name="_Toc15" w:id="15"/>
       <w:r>
         <w:t xml:space="preserve">3. Camada 2 — Estados e tribunais de contas</w:t>
       </w:r>
+      <w:bookmarkEnd w:id="15"/>
     </w:p>
     <w:p>
       <w:pPr>
@@ -8104,9 +8738,11 @@
         <w:keepLines/>
         <w:spacing w:after="160" w:before="380"/>
       </w:pPr>
+      <w:bookmarkStart w:name="_Toc16" w:id="16"/>
       <w:r>
         <w:t xml:space="preserve">4. Camada 3 — Municípios</w:t>
       </w:r>
+      <w:bookmarkEnd w:id="16"/>
     </w:p>
     <w:p>
       <w:pPr>
@@ -8115,9 +8751,11 @@
         <w:keepLines/>
         <w:spacing w:after="120" w:before="280"/>
       </w:pPr>
+      <w:bookmarkStart w:name="_Toc17" w:id="17"/>
       <w:r>
         <w:t xml:space="preserve">4.1 Abordagem por família de plataforma</w:t>
       </w:r>
+      <w:bookmarkEnd w:id="17"/>
     </w:p>
     <w:p>
       <w:pPr>
@@ -8246,9 +8884,11 @@
         <w:keepLines/>
         <w:spacing w:after="120" w:before="280"/>
       </w:pPr>
+      <w:bookmarkStart w:name="_Toc18" w:id="18"/>
       <w:r>
         <w:t xml:space="preserve">4.2 Cauda longa</w:t>
       </w:r>
+      <w:bookmarkEnd w:id="18"/>
     </w:p>
     <w:tbl>
       <w:tblPr>
@@ -8689,9 +9329,11 @@
         <w:keepLines/>
         <w:spacing w:after="120" w:before="280"/>
       </w:pPr>
+      <w:bookmarkStart w:name="_Toc19" w:id="19"/>
       <w:r>
         <w:t xml:space="preserve">4.3 Especificação declarativa de fonte</w:t>
       </w:r>
+      <w:bookmarkEnd w:id="19"/>
     </w:p>
     <w:p>
       <w:pPr>
@@ -10003,9 +10645,11 @@
         <w:keepLines/>
         <w:spacing w:after="160" w:before="380"/>
       </w:pPr>
+      <w:bookmarkStart w:name="_Toc20" w:id="20"/>
       <w:r>
         <w:t xml:space="preserve">5. Política de coleta responsável</w:t>
       </w:r>
+      <w:bookmarkEnd w:id="20"/>
     </w:p>
     <w:p>
       <w:pPr>
@@ -10873,9 +11517,11 @@
         <w:keepLines/>
         <w:spacing w:after="160" w:before="380"/>
       </w:pPr>
+      <w:bookmarkStart w:name="_Toc21" w:id="21"/>
       <w:r>
         <w:t xml:space="preserve">6. Matriz de cobertura esperada por fase</w:t>
       </w:r>
+      <w:bookmarkEnd w:id="21"/>
     </w:p>
     <w:tbl>
       <w:tblPr>
@@ -11421,9 +12067,11 @@
         <w:keepLines/>
         <w:spacing w:after="160" w:before="380"/>
       </w:pPr>
+      <w:bookmarkStart w:name="_Toc22" w:id="22"/>
       <w:r>
         <w:t xml:space="preserve">7. Situação da integração (outubro de 2026)</w:t>
       </w:r>
+      <w:bookmarkEnd w:id="22"/>
     </w:p>
     <w:tbl>
       <w:tblPr>
@@ -12743,9 +13391,11 @@
         <w:keepLines/>
         <w:spacing w:after="160" w:before="380"/>
       </w:pPr>
+      <w:bookmarkStart w:name="_Toc23" w:id="23"/>
       <w:r>
         <w:t xml:space="preserve">8. Registro de fontes</w:t>
       </w:r>
+      <w:bookmarkEnd w:id="23"/>
     </w:p>
     <w:p>
       <w:pPr>
@@ -13695,6 +14345,21 @@
   <w:style w:type="paragraph" w:styleId="Normal" w:default="1">
     <w:name w:val="Normal"/>
     <w:qFormat/>
+  </w:style>
+  <w:style w:type="table" w:styleId="TableNormal" w:default="true">
+    <w:name w:val="Normal Table"/>
+    <w:uiPriority w:val="99"/>
+    <w:semiHidden/>
+    <w:unhideWhenUsed/>
+    <w:tblPr>
+      <w:tblInd w:type="dxa" w:w="0"/>
+      <w:tblCellMar>
+        <w:top w:type="dxa" w:w="0"/>
+        <w:left w:type="dxa" w:w="108"/>
+        <w:bottom w:type="dxa" w:w="0"/>
+        <w:right w:type="dxa" w:w="108"/>
+      </w:tblCellMar>
+    </w:tblPr>
   </w:style>
   <w:style w:type="paragraph" w:styleId="Title">
     <w:name w:val="Title"/>

</xml_diff>

<commit_message>
Economia: rendimento médio real da PNAD Contínua, direto do SIDRA (ADR-033, adendo)
Nenhuma série de rendimento do SGS (24380 a 24383) conferiu com a tabela 6390
do SIDRA: o rendimento real está a preços do último trimestre e é recalculado
a cada divulgação. Pela regra do catálogo, a série vem da fonte primária: o
catálogo ganha séries do SIDRA (codigo nulo, sidra com a consulta), com
coleta própria (coletar_sidra, que regrava a série inteira), teste de
contrato e o link da consulta no portal, que passa a mostrar valores em reais.
No grupo Trabalho, com os releases da PNAD Contínua. DOC-06 1.7 e DOC-11
regerados.
</commit_message>
<xml_diff>
--- a/docs/DOC-06_Catalogo_de_Fontes.docx
+++ b/docs/DOC-06_Catalogo_de_Fontes.docx
@@ -267,7 +267,7 @@
                 <w:sz w:val="19"/>
                 <w:szCs w:val="19"/>
               </w:rPr>
-              <w:t xml:space="preserve">1.6</w:t>
+              <w:t xml:space="preserve">1.7</w:t>
             </w:r>
           </w:p>
         </w:tc>
@@ -7686,7 +7686,7 @@
                 <w:sz w:val="17"/>
                 <w:szCs w:val="17"/>
               </w:rPr>
-              <w:t xml:space="preserve">Notícias v3 (releases)</w:t>
+              <w:t xml:space="preserve">SIDRA (valores)</w:t>
             </w:r>
           </w:p>
         </w:tc>
@@ -7713,6 +7713,92 @@
                 <w:sz w:val="17"/>
                 <w:szCs w:val="17"/>
               </w:rPr>
+              <w:t xml:space="preserve">apisidra.ibge.gov.br/values, tabela 6390, variável 5933</w:t>
+            </w:r>
+          </w:p>
+        </w:tc>
+        <w:tc>
+          <w:tcPr>
+            <w:tcW w:type="dxa" w:w="3000"/>
+            <w:shd w:fill="F2F2F2" w:val="clear"/>
+            <w:tcMar>
+              <w:top w:type="dxa" w:w="70"/>
+              <w:left w:type="dxa" w:w="110"/>
+              <w:bottom w:type="dxa" w:w="70"/>
+              <w:right w:type="dxa" w:w="110"/>
+            </w:tcMar>
+            <w:vAlign w:val="center"/>
+          </w:tcPr>
+          <w:p>
+            <w:pPr>
+              <w:spacing w:after="0"/>
+            </w:pPr>
+            <w:r>
+              <w:rPr>
+                <w:b w:val="false"/>
+                <w:bCs w:val="false"/>
+                <w:sz w:val="17"/>
+                <w:szCs w:val="17"/>
+              </w:rPr>
+              <w:t xml:space="preserve">Rendimento médio real habitual da PNAD Contínua na área Economia, por trimestre móvel; recalculado inteiro a cada divulgação, por isso a série é regravada a cada coleta (ADR-033)</w:t>
+            </w:r>
+          </w:p>
+        </w:tc>
+      </w:tr>
+      <w:tr>
+        <w:trPr>
+          <w:cantSplit/>
+        </w:trPr>
+        <w:tc>
+          <w:tcPr>
+            <w:tcW w:type="dxa" w:w="2200"/>
+            <w:shd w:fill="FFFFFF" w:val="clear"/>
+            <w:tcMar>
+              <w:top w:type="dxa" w:w="70"/>
+              <w:left w:type="dxa" w:w="110"/>
+              <w:bottom w:type="dxa" w:w="70"/>
+              <w:right w:type="dxa" w:w="110"/>
+            </w:tcMar>
+            <w:vAlign w:val="center"/>
+          </w:tcPr>
+          <w:p>
+            <w:pPr>
+              <w:spacing w:after="0"/>
+            </w:pPr>
+            <w:r>
+              <w:rPr>
+                <w:b w:val="false"/>
+                <w:bCs w:val="false"/>
+                <w:sz w:val="17"/>
+                <w:szCs w:val="17"/>
+              </w:rPr>
+              <w:t xml:space="preserve">Notícias v3 (releases)</w:t>
+            </w:r>
+          </w:p>
+        </w:tc>
+        <w:tc>
+          <w:tcPr>
+            <w:tcW w:type="dxa" w:w="4400"/>
+            <w:shd w:fill="FFFFFF" w:val="clear"/>
+            <w:tcMar>
+              <w:top w:type="dxa" w:w="70"/>
+              <w:left w:type="dxa" w:w="110"/>
+              <w:bottom w:type="dxa" w:w="70"/>
+              <w:right w:type="dxa" w:w="110"/>
+            </w:tcMar>
+            <w:vAlign w:val="center"/>
+          </w:tcPr>
+          <w:p>
+            <w:pPr>
+              <w:spacing w:after="0"/>
+            </w:pPr>
+            <w:r>
+              <w:rPr>
+                <w:b w:val="false"/>
+                <w:bCs w:val="false"/>
+                <w:sz w:val="17"/>
+                <w:szCs w:val="17"/>
+              </w:rPr>
               <w:t xml:space="preserve">servicodados.ibge.gov.br/api/v3/noticias, tipo=release e idproduto</w:t>
             </w:r>
           </w:p>
@@ -7720,7 +7806,7 @@
         <w:tc>
           <w:tcPr>
             <w:tcW w:type="dxa" w:w="3000"/>
-            <w:shd w:fill="F2F2F2" w:val="clear"/>
+            <w:shd w:fill="FFFFFF" w:val="clear"/>
             <w:tcMar>
               <w:top w:type="dxa" w:w="70"/>
               <w:left w:type="dxa" w:w="110"/>

</xml_diff>

<commit_message>
Economia: despesa da União por função nos mandatos presidenciais (ADR-033, adendo)
Grupo novo Despesa da União: o total e seis funções (previdência, encargos
especiais, saúde, educação, assistência social e defesa), pelo RREO da União
do 6º bimestre, Anexo 2, no SICONFI, de 2015 em diante. A leitura usa a
coluna da despesa liquidada (que mudou de nome em 2016), deixa de fora o
bloco das intraorçamentárias e confere que as 28 funções da Portaria 42/1999
somam o total. Os valores vão em bilhões de reais do último ano, corrigidos
pelo IPCA médio de cada ano, e a comparação de mandatos usa a média anual
(agregação nova valor_anual). Coleta diária dos anos que faltam e dos dois
últimos; teste de contrato do anexo. DOC-06 1.9 e DOC-11 regerados.
</commit_message>
<xml_diff>
--- a/docs/DOC-06_Catalogo_de_Fontes.docx
+++ b/docs/DOC-06_Catalogo_de_Fontes.docx
@@ -267,7 +267,7 @@
                 <w:sz w:val="19"/>
                 <w:szCs w:val="19"/>
               </w:rPr>
-              <w:t xml:space="preserve">1.8</w:t>
+              <w:t xml:space="preserve">1.9</w:t>
             </w:r>
           </w:p>
         </w:tc>
@@ -4314,6 +4314,65 @@
                 <w:sz w:val="17"/>
                 <w:szCs w:val="17"/>
               </w:rPr>
+              <w:t xml:space="preserve">RREO da União (id_ente=1), Anexo 2: despesa por função de 2015 em diante; funções e subfunções na mesma lista, sem marcação; a coluna da liquidada mudou de nome em 2016 e, depois, as funções se repetem num bloco das intraorçamentárias</w:t>
+            </w:r>
+          </w:p>
+        </w:tc>
+        <w:tc>
+          <w:tcPr>
+            <w:tcW w:type="dxa" w:w="5000"/>
+            <w:shd w:fill="F2F2F2" w:val="clear"/>
+            <w:tcMar>
+              <w:top w:type="dxa" w:w="70"/>
+              <w:left w:type="dxa" w:w="110"/>
+              <w:bottom w:type="dxa" w:w="70"/>
+              <w:right w:type="dxa" w:w="110"/>
+            </w:tcMar>
+            <w:vAlign w:val="center"/>
+          </w:tcPr>
+          <w:p>
+            <w:pPr>
+              <w:spacing w:after="0"/>
+            </w:pPr>
+            <w:r>
+              <w:rPr>
+                <w:b w:val="false"/>
+                <w:bCs w:val="false"/>
+                <w:sz w:val="17"/>
+                <w:szCs w:val="17"/>
+              </w:rPr>
+              <w:t xml:space="preserve">As 28 funções da Portaria 42/1999 somam o total (conferido em toda leitura); em bilhões de reais corrigidos pelo IPCA na Economia (ADR-033)</w:t>
+            </w:r>
+          </w:p>
+        </w:tc>
+      </w:tr>
+      <w:tr>
+        <w:trPr>
+          <w:cantSplit/>
+        </w:trPr>
+        <w:tc>
+          <w:tcPr>
+            <w:tcW w:type="dxa" w:w="4600"/>
+            <w:shd w:fill="FFFFFF" w:val="clear"/>
+            <w:tcMar>
+              <w:top w:type="dxa" w:w="70"/>
+              <w:left w:type="dxa" w:w="110"/>
+              <w:bottom w:type="dxa" w:w="70"/>
+              <w:right w:type="dxa" w:w="110"/>
+            </w:tcMar>
+            <w:vAlign w:val="center"/>
+          </w:tcPr>
+          <w:p>
+            <w:pPr>
+              <w:spacing w:after="0"/>
+            </w:pPr>
+            <w:r>
+              <w:rPr>
+                <w:b w:val="false"/>
+                <w:bCs w:val="false"/>
+                <w:sz w:val="17"/>
+                <w:szCs w:val="17"/>
+              </w:rPr>
               <w:t xml:space="preserve">A RCL fica no Anexo 03, conta RREO3ReceitaCorrenteLiquida, coluna TOTAL (ÚLTIMOS 12 MESES); a resposta do anexo tem perto de 430 linhas por ente, com valores numéricos</w:t>
             </w:r>
           </w:p>
@@ -4321,7 +4380,7 @@
         <w:tc>
           <w:tcPr>
             <w:tcW w:type="dxa" w:w="5000"/>
-            <w:shd w:fill="F2F2F2" w:val="clear"/>
+            <w:shd w:fill="FFFFFF" w:val="clear"/>
             <w:tcMar>
               <w:top w:type="dxa" w:w="70"/>
               <w:left w:type="dxa" w:w="110"/>

</xml_diff>

<commit_message>
Economia: receita da União nos mandatos presidenciais (ADR-033, adendo)
Grupo novo Receita da União: receita corrente, impostos, contribuições
sociais, receita patrimonial e operações de crédito (sem o refinanciamento),
pelo RREO da União do 6º bimestre, Anexo 1, de 2015 em diante. A leitura usa
os códigos de conta, que são os mesmos de 2015 a 2025 (o nome muda), na
coluna da receita realizada, e confere que as partes da receita corrente
somam o total (ao centavo nos 11 anos). Mesmos valores e comparação da
despesa: bilhões de reais do último ano pelo IPCA médio e média anual no
período. Coleta diária dos anos que faltam e dos dois últimos; teste de
contrato do anexo. DOC-06 2.1 e DOC-11 regerados.
</commit_message>
<xml_diff>
--- a/docs/DOC-06_Catalogo_de_Fontes.docx
+++ b/docs/DOC-06_Catalogo_de_Fontes.docx
@@ -267,7 +267,7 @@
                 <w:sz w:val="19"/>
                 <w:szCs w:val="19"/>
               </w:rPr>
-              <w:t xml:space="preserve">2.0</w:t>
+              <w:t xml:space="preserve">2.1</w:t>
             </w:r>
           </w:p>
         </w:tc>
@@ -4314,7 +4314,7 @@
                 <w:sz w:val="17"/>
                 <w:szCs w:val="17"/>
               </w:rPr>
-              <w:t xml:space="preserve">RREO da União (id_ente=1), Anexo 2: despesa por função de 2015 em diante; funções e subfunções na mesma lista, sem marcação; a coluna da liquidada mudou de nome em 2016 e, depois, as funções se repetem num bloco das intraorçamentárias</w:t>
+              <w:t xml:space="preserve">RREO da União (id_ente=1), Anexo 1: receita realizada (coluna "Até o Bimestre (c)") de 2015 em diante; o nome das contas muda, o código não; o bloco das intraorçamentárias tem códigos próprios</w:t>
             </w:r>
           </w:p>
         </w:tc>
@@ -4341,7 +4341,7 @@
                 <w:sz w:val="17"/>
                 <w:szCs w:val="17"/>
               </w:rPr>
-              <w:t xml:space="preserve">As 28 funções da Portaria 42/1999 somam o total (conferido em toda leitura); em bilhões de reais corrigidos pelo IPCA na Economia (ADR-033)</w:t>
+              <w:t xml:space="preserve">As partes da receita corrente somam o total (conferido em toda leitura); em bilhões de reais corrigidos pelo IPCA na Economia (ADR-033)</w:t>
             </w:r>
           </w:p>
         </w:tc>
@@ -4373,6 +4373,65 @@
                 <w:sz w:val="17"/>
                 <w:szCs w:val="17"/>
               </w:rPr>
+              <w:t xml:space="preserve">RREO da União (id_ente=1), Anexo 2: despesa por função de 2015 em diante; funções e subfunções na mesma lista, sem marcação; a coluna da liquidada mudou de nome em 2016 e, depois, as funções se repetem num bloco das intraorçamentárias</w:t>
+            </w:r>
+          </w:p>
+        </w:tc>
+        <w:tc>
+          <w:tcPr>
+            <w:tcW w:type="dxa" w:w="5000"/>
+            <w:shd w:fill="FFFFFF" w:val="clear"/>
+            <w:tcMar>
+              <w:top w:type="dxa" w:w="70"/>
+              <w:left w:type="dxa" w:w="110"/>
+              <w:bottom w:type="dxa" w:w="70"/>
+              <w:right w:type="dxa" w:w="110"/>
+            </w:tcMar>
+            <w:vAlign w:val="center"/>
+          </w:tcPr>
+          <w:p>
+            <w:pPr>
+              <w:spacing w:after="0"/>
+            </w:pPr>
+            <w:r>
+              <w:rPr>
+                <w:b w:val="false"/>
+                <w:bCs w:val="false"/>
+                <w:sz w:val="17"/>
+                <w:szCs w:val="17"/>
+              </w:rPr>
+              <w:t xml:space="preserve">As 28 funções da Portaria 42/1999 somam o total (conferido em toda leitura); em bilhões de reais corrigidos pelo IPCA na Economia (ADR-033)</w:t>
+            </w:r>
+          </w:p>
+        </w:tc>
+      </w:tr>
+      <w:tr>
+        <w:trPr>
+          <w:cantSplit/>
+        </w:trPr>
+        <w:tc>
+          <w:tcPr>
+            <w:tcW w:type="dxa" w:w="4600"/>
+            <w:shd w:fill="F2F2F2" w:val="clear"/>
+            <w:tcMar>
+              <w:top w:type="dxa" w:w="70"/>
+              <w:left w:type="dxa" w:w="110"/>
+              <w:bottom w:type="dxa" w:w="70"/>
+              <w:right w:type="dxa" w:w="110"/>
+            </w:tcMar>
+            <w:vAlign w:val="center"/>
+          </w:tcPr>
+          <w:p>
+            <w:pPr>
+              <w:spacing w:after="0"/>
+            </w:pPr>
+            <w:r>
+              <w:rPr>
+                <w:b w:val="false"/>
+                <w:bCs w:val="false"/>
+                <w:sz w:val="17"/>
+                <w:szCs w:val="17"/>
+              </w:rPr>
               <w:t xml:space="preserve">A RCL fica no Anexo 03, conta RREO3ReceitaCorrenteLiquida, coluna TOTAL (ÚLTIMOS 12 MESES); a resposta do anexo tem perto de 430 linhas por ente, com valores numéricos</w:t>
             </w:r>
           </w:p>
@@ -4380,7 +4439,7 @@
         <w:tc>
           <w:tcPr>
             <w:tcW w:type="dxa" w:w="5000"/>
-            <w:shd w:fill="FFFFFF" w:val="clear"/>
+            <w:shd w:fill="F2F2F2" w:val="clear"/>
             <w:tcMar>
               <w:top w:type="dxa" w:w="70"/>
               <w:left w:type="dxa" w:w="110"/>

</xml_diff>

<commit_message>
Convênios da União nos governos municipais (ADR-045)
lumen painel convenios, no fluxo diário dos painéis, lê o arquivo de convênios
do Portal da Transparência (dados abertos, sem chave) só quando sai um novo:
623 mil convênios, dos quais entram os de 2001 em diante, por ente, pelo tipo
do convenente (prefeitura, entidades, empresas e outros no município; o
estado na UF; pessoa física só na soma). Anulados e excluídos ficam de fora.
A tabela de apelidos de município ganhou os nomes antigos e as grafias dos
convênios (Parati, Januário Cicco, Brasópolis...); só os convênios no
exterior ficam sem lugar.

O mandato aberto em Governos municipais mostra os convênios iniciados nele:
conveniado, liberado, a situação no SIAFI e a lista, com o link do
convenente para as contratações dele no município, e o outro mandato ao lado
na comparação. DOC-06 2.5, DOC-13 1.9 e DOC-11 regerados.
</commit_message>
<xml_diff>
--- a/docs/DOC-06_Catalogo_de_Fontes.docx
+++ b/docs/DOC-06_Catalogo_de_Fontes.docx
@@ -267,7 +267,7 @@
                 <w:sz w:val="19"/>
                 <w:szCs w:val="19"/>
               </w:rPr>
-              <w:t xml:space="preserve">2.4</w:t>
+              <w:t xml:space="preserve">2.5</w:t>
             </w:r>
           </w:p>
         </w:tc>
@@ -13316,7 +13316,7 @@
                 <w:sz w:val="17"/>
                 <w:szCs w:val="17"/>
               </w:rPr>
-              <w:t xml:space="preserve">CEIS, CNEP, CEPIM e emendas parlamentares em uso</w:t>
+              <w:t xml:space="preserve">CEIS, CNEP, CEPIM, emendas parlamentares e convênios em uso</w:t>
             </w:r>
           </w:p>
         </w:tc>
@@ -13343,7 +13343,7 @@
                 <w:sz w:val="17"/>
                 <w:szCs w:val="17"/>
               </w:rPr>
-              <w:t xml:space="preserve">Pelos arquivos de dados abertos, sem chave (ADR-030 e ADR-044); convênios e despesas pendentes, pelo mesmo caminho</w:t>
+              <w:t xml:space="preserve">Pelos arquivos de dados abertos, sem chave (ADR-030, ADR-044 e ADR-045); transferências e despesas pendentes, pelo mesmo caminho</w:t>
             </w:r>
           </w:p>
         </w:tc>

</xml_diff>

<commit_message>
Tribunais de contas: o levantamento e os contratos do TCE-RS (ADR-050)
- Levantamento dos 32 tribunais que fiscalizam municípios (wiki "Tribunais de contas"):
  sete publicam licitações ou contratos em lote, sem chave; ordem de integração TCE-RS,
  TCE-SP, TCE-PR, TCE-PE e TCE-CE, e pedido formal aos que exigem captcha ou token.
- lumen painel tce-rs e o fluxo diário tce: os contratos dos órgãos gaúchos no LicitaCon
  desde 2016, lidos no servidor por partes (Range), uns 5 MB por ano em vez de 130 MB;
  por ente e ano, com o teto de plausibilidade do PNCP, aditivos, pessoa física só na
  soma e os fornecedores.
- Publicação em tce/ente/<grupo>.json.gz e no índice por CNPJ (ADR-049).
- Governos municipais: os contratos no tribunal no mandato aberto, com o outro mandato
  ao lado; página da empresa: os contratos no tribunal, por ente. Lado a lado com o PNCP,
  sem somar.
</commit_message>
<xml_diff>
--- a/docs/DOC-06_Catalogo_de_Fontes.docx
+++ b/docs/DOC-06_Catalogo_de_Fontes.docx
@@ -267,7 +267,7 @@
                 <w:sz w:val="19"/>
                 <w:szCs w:val="19"/>
               </w:rPr>
-              <w:t xml:space="preserve">2.5</w:t>
+              <w:t xml:space="preserve">2.6</w:t>
             </w:r>
           </w:p>
         </w:tc>
@@ -801,37 +801,37 @@
         </w:p>
         <w:p>
           <w:pPr>
-            <w:pStyle w:val="TOC1"/>
-            <w:tabs>
-              <w:tab w:val="right" w:pos="9638" w:leader="dot"/>
-            </w:tabs>
-          </w:pPr>
-          <w:hyperlink w:history="1" w:anchor="_Toc16">
-            <w:r>
-              <w:t xml:space="preserve">4. Camada 3 — Municípios</w:t>
-            </w:r>
-            <w:r>
-              <w:tab/>
-            </w:r>
-            <w:r>
-              <w:fldChar w:fldCharType="begin" w:dirty="true"/>
-              <w:instrText xml:space="preserve">PAGEREF _Toc16 \h</w:instrText>
-              <w:fldChar w:fldCharType="separate"/>
-              <w:fldChar w:fldCharType="end"/>
-            </w:r>
-          </w:hyperlink>
-        </w:p>
-        <w:p>
-          <w:pPr>
             <w:pStyle w:val="TOC2"/>
             <w:tabs>
               <w:tab w:val="right" w:pos="9638" w:leader="dot"/>
             </w:tabs>
             <w:ind w:left="220"/>
           </w:pPr>
+          <w:hyperlink w:history="1" w:anchor="_Toc16">
+            <w:r>
+              <w:t xml:space="preserve">3.1 Levantamento dos tribunais de contas (21/10/2026, ADR-050)</w:t>
+            </w:r>
+            <w:r>
+              <w:tab/>
+            </w:r>
+            <w:r>
+              <w:fldChar w:fldCharType="begin" w:dirty="true"/>
+              <w:instrText xml:space="preserve">PAGEREF _Toc16 \h</w:instrText>
+              <w:fldChar w:fldCharType="separate"/>
+              <w:fldChar w:fldCharType="end"/>
+            </w:r>
+          </w:hyperlink>
+        </w:p>
+        <w:p>
+          <w:pPr>
+            <w:pStyle w:val="TOC1"/>
+            <w:tabs>
+              <w:tab w:val="right" w:pos="9638" w:leader="dot"/>
+            </w:tabs>
+          </w:pPr>
           <w:hyperlink w:history="1" w:anchor="_Toc17">
             <w:r>
-              <w:t xml:space="preserve">4.1 Abordagem por família de plataforma</w:t>
+              <w:t xml:space="preserve">4. Camada 3 — Municípios</w:t>
             </w:r>
             <w:r>
               <w:tab/>
@@ -854,7 +854,7 @@
           </w:pPr>
           <w:hyperlink w:history="1" w:anchor="_Toc18">
             <w:r>
-              <w:t xml:space="preserve">4.2 Cauda longa</w:t>
+              <w:t xml:space="preserve">4.1 Abordagem por família de plataforma</w:t>
             </w:r>
             <w:r>
               <w:tab/>
@@ -877,7 +877,7 @@
           </w:pPr>
           <w:hyperlink w:history="1" w:anchor="_Toc19">
             <w:r>
-              <w:t xml:space="preserve">4.3 Especificação declarativa de fonte</w:t>
+              <w:t xml:space="preserve">4.2 Cauda longa</w:t>
             </w:r>
             <w:r>
               <w:tab/>
@@ -892,14 +892,15 @@
         </w:p>
         <w:p>
           <w:pPr>
-            <w:pStyle w:val="TOC1"/>
+            <w:pStyle w:val="TOC2"/>
             <w:tabs>
               <w:tab w:val="right" w:pos="9638" w:leader="dot"/>
             </w:tabs>
+            <w:ind w:left="220"/>
           </w:pPr>
           <w:hyperlink w:history="1" w:anchor="_Toc20">
             <w:r>
-              <w:t xml:space="preserve">5. Política de coleta responsável</w:t>
+              <w:t xml:space="preserve">4.3 Especificação declarativa de fonte</w:t>
             </w:r>
             <w:r>
               <w:tab/>
@@ -921,7 +922,7 @@
           </w:pPr>
           <w:hyperlink w:history="1" w:anchor="_Toc21">
             <w:r>
-              <w:t xml:space="preserve">6. Matriz de cobertura esperada por fase</w:t>
+              <w:t xml:space="preserve">5. Política de coleta responsável</w:t>
             </w:r>
             <w:r>
               <w:tab/>
@@ -943,7 +944,7 @@
           </w:pPr>
           <w:hyperlink w:history="1" w:anchor="_Toc22">
             <w:r>
-              <w:t xml:space="preserve">7. Situação da integração (outubro de 2026)</w:t>
+              <w:t xml:space="preserve">6. Matriz de cobertura esperada por fase</w:t>
             </w:r>
             <w:r>
               <w:tab/>
@@ -965,7 +966,7 @@
           </w:pPr>
           <w:hyperlink w:history="1" w:anchor="_Toc23">
             <w:r>
-              <w:t xml:space="preserve">8. Registro de fontes</w:t>
+              <w:t xml:space="preserve">7. Situação da integração (outubro de 2026)</w:t>
             </w:r>
             <w:r>
               <w:tab/>
@@ -973,6 +974,28 @@
             <w:r>
               <w:fldChar w:fldCharType="begin" w:dirty="true"/>
               <w:instrText xml:space="preserve">PAGEREF _Toc23 \h</w:instrText>
+              <w:fldChar w:fldCharType="separate"/>
+              <w:fldChar w:fldCharType="end"/>
+            </w:r>
+          </w:hyperlink>
+        </w:p>
+        <w:p>
+          <w:pPr>
+            <w:pStyle w:val="TOC1"/>
+            <w:tabs>
+              <w:tab w:val="right" w:pos="9638" w:leader="dot"/>
+            </w:tabs>
+          </w:pPr>
+          <w:hyperlink w:history="1" w:anchor="_Toc24">
+            <w:r>
+              <w:t xml:space="preserve">8. Registro de fontes</w:t>
+            </w:r>
+            <w:r>
+              <w:tab/>
+            </w:r>
+            <w:r>
+              <w:fldChar w:fldCharType="begin" w:dirty="true"/>
+              <w:instrText xml:space="preserve">PAGEREF _Toc24 \h</w:instrText>
               <w:fldChar w:fldCharType="separate"/>
               <w:fldChar w:fldCharType="end"/>
             </w:r>
@@ -9214,16 +9237,508 @@
     </w:p>
     <w:p>
       <w:pPr>
+        <w:pStyle w:val="Heading2"/>
+        <w:keepNext/>
+        <w:keepLines/>
+        <w:spacing w:after="120" w:before="280"/>
+      </w:pPr>
+      <w:bookmarkStart w:name="_Toc16" w:id="16"/>
+      <w:r>
+        <w:t xml:space="preserve">3.1 Levantamento dos tribunais de contas (21/10/2026, ADR-050)</w:t>
+      </w:r>
+      <w:bookmarkEnd w:id="16"/>
+    </w:p>
+    <w:p>
+      <w:pPr>
+        <w:spacing w:after="120"/>
+      </w:pPr>
+      <w:r>
+        <w:rPr>
+          <w:b w:val="false"/>
+          <w:bCs w:val="false"/>
+          <w:i w:val="false"/>
+          <w:iCs w:val="false"/>
+        </w:rPr>
+        <w:t xml:space="preserve">Os 32 tribunais que fiscalizam municípios foram levantados com as APIs e os downloads testados. A tabela completa está na wiki, página "Tribunais de contas". Em resumo:</w:t>
+      </w:r>
+    </w:p>
+    <w:tbl>
+      <w:tblPr>
+        <w:tblW w:type="dxa" w:w="9600"/>
+        <w:tblBorders>
+          <w:top w:val="single" w:color="BFBFBF" w:sz="4"/>
+          <w:left w:val="single" w:color="BFBFBF" w:sz="4"/>
+          <w:bottom w:val="single" w:color="BFBFBF" w:sz="4"/>
+          <w:right w:val="single" w:color="BFBFBF" w:sz="4"/>
+          <w:insideH w:val="single" w:color="D9D9D9" w:sz="2"/>
+          <w:insideV w:val="single" w:color="D9D9D9" w:sz="2"/>
+        </w:tblBorders>
+      </w:tblPr>
+      <w:tblGrid>
+        <w:gridCol w:w="3000"/>
+        <w:gridCol w:w="4600"/>
+        <w:gridCol w:w="2000"/>
+      </w:tblGrid>
+      <w:tr>
+        <w:trPr>
+          <w:tblHeader/>
+        </w:trPr>
+        <w:tc>
+          <w:tcPr>
+            <w:tcW w:type="dxa" w:w="3000"/>
+            <w:shd w:fill="1F3864" w:val="clear"/>
+            <w:tcMar>
+              <w:top w:type="dxa" w:w="80"/>
+              <w:left w:type="dxa" w:w="110"/>
+              <w:bottom w:type="dxa" w:w="80"/>
+              <w:right w:type="dxa" w:w="110"/>
+            </w:tcMar>
+            <w:vAlign w:val="center"/>
+          </w:tcPr>
+          <w:p>
+            <w:pPr>
+              <w:spacing w:after="0"/>
+            </w:pPr>
+            <w:r>
+              <w:rPr>
+                <w:b/>
+                <w:bCs/>
+                <w:color w:val="FFFFFF"/>
+                <w:sz w:val="19"/>
+                <w:szCs w:val="19"/>
+              </w:rPr>
+              <w:t xml:space="preserve">Situação</w:t>
+            </w:r>
+          </w:p>
+        </w:tc>
+        <w:tc>
+          <w:tcPr>
+            <w:tcW w:type="dxa" w:w="4600"/>
+            <w:shd w:fill="1F3864" w:val="clear"/>
+            <w:tcMar>
+              <w:top w:type="dxa" w:w="80"/>
+              <w:left w:type="dxa" w:w="110"/>
+              <w:bottom w:type="dxa" w:w="80"/>
+              <w:right w:type="dxa" w:w="110"/>
+            </w:tcMar>
+            <w:vAlign w:val="center"/>
+          </w:tcPr>
+          <w:p>
+            <w:pPr>
+              <w:spacing w:after="0"/>
+            </w:pPr>
+            <w:r>
+              <w:rPr>
+                <w:b/>
+                <w:bCs/>
+                <w:color w:val="FFFFFF"/>
+                <w:sz w:val="19"/>
+                <w:szCs w:val="19"/>
+              </w:rPr>
+              <w:t xml:space="preserve">Tribunais</w:t>
+            </w:r>
+          </w:p>
+        </w:tc>
+        <w:tc>
+          <w:tcPr>
+            <w:tcW w:type="dxa" w:w="2000"/>
+            <w:shd w:fill="1F3864" w:val="clear"/>
+            <w:tcMar>
+              <w:top w:type="dxa" w:w="80"/>
+              <w:left w:type="dxa" w:w="110"/>
+              <w:bottom w:type="dxa" w:w="80"/>
+              <w:right w:type="dxa" w:w="110"/>
+            </w:tcMar>
+            <w:vAlign w:val="center"/>
+          </w:tcPr>
+          <w:p>
+            <w:pPr>
+              <w:spacing w:after="0"/>
+            </w:pPr>
+            <w:r>
+              <w:rPr>
+                <w:b/>
+                <w:bCs/>
+                <w:color w:val="FFFFFF"/>
+                <w:sz w:val="19"/>
+                <w:szCs w:val="19"/>
+              </w:rPr>
+              <w:t xml:space="preserve">Municípios</w:t>
+            </w:r>
+          </w:p>
+        </w:tc>
+      </w:tr>
+      <w:tr>
+        <w:trPr>
+          <w:cantSplit/>
+        </w:trPr>
+        <w:tc>
+          <w:tcPr>
+            <w:tcW w:type="dxa" w:w="3000"/>
+            <w:shd w:fill="FFFFFF" w:val="clear"/>
+            <w:tcMar>
+              <w:top w:type="dxa" w:w="70"/>
+              <w:left w:type="dxa" w:w="110"/>
+              <w:bottom w:type="dxa" w:w="70"/>
+              <w:right w:type="dxa" w:w="110"/>
+            </w:tcMar>
+            <w:vAlign w:val="center"/>
+          </w:tcPr>
+          <w:p>
+            <w:pPr>
+              <w:spacing w:after="0"/>
+            </w:pPr>
+            <w:r>
+              <w:rPr>
+                <w:b w:val="false"/>
+                <w:bCs w:val="false"/>
+                <w:sz w:val="17"/>
+                <w:szCs w:val="17"/>
+              </w:rPr>
+              <w:t xml:space="preserve">Licitações ou contratos em lote, sem chave</w:t>
+            </w:r>
+          </w:p>
+        </w:tc>
+        <w:tc>
+          <w:tcPr>
+            <w:tcW w:type="dxa" w:w="4600"/>
+            <w:shd w:fill="FFFFFF" w:val="clear"/>
+            <w:tcMar>
+              <w:top w:type="dxa" w:w="70"/>
+              <w:left w:type="dxa" w:w="110"/>
+              <w:bottom w:type="dxa" w:w="70"/>
+              <w:right w:type="dxa" w:w="110"/>
+            </w:tcMar>
+            <w:vAlign w:val="center"/>
+          </w:tcPr>
+          <w:p>
+            <w:pPr>
+              <w:spacing w:after="0"/>
+            </w:pPr>
+            <w:r>
+              <w:rPr>
+                <w:b w:val="false"/>
+                <w:bCs w:val="false"/>
+                <w:sz w:val="17"/>
+                <w:szCs w:val="17"/>
+              </w:rPr>
+              <w:t xml:space="preserve">TCE-SP (desde 2018), TCE-RS (2016), TCE-PR (2013), TCE-PE (2011), TCE-CE (2003), TCE-RJ (2020), TCE-ES (2022)</w:t>
+            </w:r>
+          </w:p>
+        </w:tc>
+        <w:tc>
+          <w:tcPr>
+            <w:tcW w:type="dxa" w:w="2000"/>
+            <w:shd w:fill="FFFFFF" w:val="clear"/>
+            <w:tcMar>
+              <w:top w:type="dxa" w:w="70"/>
+              <w:left w:type="dxa" w:w="110"/>
+              <w:bottom w:type="dxa" w:w="70"/>
+              <w:right w:type="dxa" w:w="110"/>
+            </w:tcMar>
+            <w:vAlign w:val="center"/>
+          </w:tcPr>
+          <w:p>
+            <w:pPr>
+              <w:spacing w:after="0"/>
+            </w:pPr>
+            <w:r>
+              <w:rPr>
+                <w:b w:val="false"/>
+                <w:bCs w:val="false"/>
+                <w:sz w:val="17"/>
+                <w:szCs w:val="17"/>
+              </w:rPr>
+              <w:t xml:space="preserve">Perto de 2.080</w:t>
+            </w:r>
+          </w:p>
+        </w:tc>
+      </w:tr>
+      <w:tr>
+        <w:trPr>
+          <w:cantSplit/>
+        </w:trPr>
+        <w:tc>
+          <w:tcPr>
+            <w:tcW w:type="dxa" w:w="3000"/>
+            <w:shd w:fill="F2F2F2" w:val="clear"/>
+            <w:tcMar>
+              <w:top w:type="dxa" w:w="70"/>
+              <w:left w:type="dxa" w:w="110"/>
+              <w:bottom w:type="dxa" w:w="70"/>
+              <w:right w:type="dxa" w:w="110"/>
+            </w:tcMar>
+            <w:vAlign w:val="center"/>
+          </w:tcPr>
+          <w:p>
+            <w:pPr>
+              <w:spacing w:after="0"/>
+            </w:pPr>
+            <w:r>
+              <w:rPr>
+                <w:b w:val="false"/>
+                <w:bCs w:val="false"/>
+                <w:sz w:val="17"/>
+                <w:szCs w:val="17"/>
+              </w:rPr>
+              <w:t xml:space="preserve">Lote aberto, incompleto ou com obstáculo</w:t>
+            </w:r>
+          </w:p>
+        </w:tc>
+        <w:tc>
+          <w:tcPr>
+            <w:tcW w:type="dxa" w:w="4600"/>
+            <w:shd w:fill="F2F2F2" w:val="clear"/>
+            <w:tcMar>
+              <w:top w:type="dxa" w:w="70"/>
+              <w:left w:type="dxa" w:w="110"/>
+              <w:bottom w:type="dxa" w:w="70"/>
+              <w:right w:type="dxa" w:w="110"/>
+            </w:tcMar>
+            <w:vAlign w:val="center"/>
+          </w:tcPr>
+          <w:p>
+            <w:pPr>
+              <w:spacing w:after="0"/>
+            </w:pPr>
+            <w:r>
+              <w:rPr>
+                <w:b w:val="false"/>
+                <w:bCs w:val="false"/>
+                <w:sz w:val="17"/>
+                <w:szCs w:val="17"/>
+              </w:rPr>
+              <w:t xml:space="preserve">TCE-PB (sem contratos), TCE-MA (SACOP por API interna), TCE-TO, TCE-AM (sem CNPJ), TCM-PA (só o mural)</w:t>
+            </w:r>
+          </w:p>
+        </w:tc>
+        <w:tc>
+          <w:tcPr>
+            <w:tcW w:type="dxa" w:w="2000"/>
+            <w:shd w:fill="F2F2F2" w:val="clear"/>
+            <w:tcMar>
+              <w:top w:type="dxa" w:w="70"/>
+              <w:left w:type="dxa" w:w="110"/>
+              <w:bottom w:type="dxa" w:w="70"/>
+              <w:right w:type="dxa" w:w="110"/>
+            </w:tcMar>
+            <w:vAlign w:val="center"/>
+          </w:tcPr>
+          <w:p>
+            <w:pPr>
+              <w:spacing w:after="0"/>
+            </w:pPr>
+            <w:r>
+              <w:rPr>
+                <w:b w:val="false"/>
+                <w:bCs w:val="false"/>
+                <w:sz w:val="17"/>
+                <w:szCs w:val="17"/>
+              </w:rPr>
+              <w:t xml:space="preserve">Perto de 790</w:t>
+            </w:r>
+          </w:p>
+        </w:tc>
+      </w:tr>
+      <w:tr>
+        <w:trPr>
+          <w:cantSplit/>
+        </w:trPr>
+        <w:tc>
+          <w:tcPr>
+            <w:tcW w:type="dxa" w:w="3000"/>
+            <w:shd w:fill="FFFFFF" w:val="clear"/>
+            <w:tcMar>
+              <w:top w:type="dxa" w:w="70"/>
+              <w:left w:type="dxa" w:w="110"/>
+              <w:bottom w:type="dxa" w:w="70"/>
+              <w:right w:type="dxa" w:w="110"/>
+            </w:tcMar>
+            <w:vAlign w:val="center"/>
+          </w:tcPr>
+          <w:p>
+            <w:pPr>
+              <w:spacing w:after="0"/>
+            </w:pPr>
+            <w:r>
+              <w:rPr>
+                <w:b w:val="false"/>
+                <w:bCs w:val="false"/>
+                <w:sz w:val="17"/>
+                <w:szCs w:val="17"/>
+              </w:rPr>
+              <w:t xml:space="preserve">Atrás de captcha, token ou só em tela</w:t>
+            </w:r>
+          </w:p>
+        </w:tc>
+        <w:tc>
+          <w:tcPr>
+            <w:tcW w:type="dxa" w:w="4600"/>
+            <w:shd w:fill="FFFFFF" w:val="clear"/>
+            <w:tcMar>
+              <w:top w:type="dxa" w:w="70"/>
+              <w:left w:type="dxa" w:w="110"/>
+              <w:bottom w:type="dxa" w:w="70"/>
+              <w:right w:type="dxa" w:w="110"/>
+            </w:tcMar>
+            <w:vAlign w:val="center"/>
+          </w:tcPr>
+          <w:p>
+            <w:pPr>
+              <w:spacing w:after="0"/>
+            </w:pPr>
+            <w:r>
+              <w:rPr>
+                <w:b w:val="false"/>
+                <w:bCs w:val="false"/>
+                <w:sz w:val="17"/>
+                <w:szCs w:val="17"/>
+              </w:rPr>
+              <w:t xml:space="preserve">TCE-MG, TCM-BA, TCE-SC, TCM-GO, TCE-MT</w:t>
+            </w:r>
+          </w:p>
+        </w:tc>
+        <w:tc>
+          <w:tcPr>
+            <w:tcW w:type="dxa" w:w="2000"/>
+            <w:shd w:fill="FFFFFF" w:val="clear"/>
+            <w:tcMar>
+              <w:top w:type="dxa" w:w="70"/>
+              <w:left w:type="dxa" w:w="110"/>
+              <w:bottom w:type="dxa" w:w="70"/>
+              <w:right w:type="dxa" w:w="110"/>
+            </w:tcMar>
+            <w:vAlign w:val="center"/>
+          </w:tcPr>
+          <w:p>
+            <w:pPr>
+              <w:spacing w:after="0"/>
+            </w:pPr>
+            <w:r>
+              <w:rPr>
+                <w:b w:val="false"/>
+                <w:bCs w:val="false"/>
+                <w:sz w:val="17"/>
+                <w:szCs w:val="17"/>
+              </w:rPr>
+              <w:t xml:space="preserve">Perto de 1.850</w:t>
+            </w:r>
+          </w:p>
+        </w:tc>
+      </w:tr>
+      <w:tr>
+        <w:trPr>
+          <w:cantSplit/>
+        </w:trPr>
+        <w:tc>
+          <w:tcPr>
+            <w:tcW w:type="dxa" w:w="3000"/>
+            <w:shd w:fill="F2F2F2" w:val="clear"/>
+            <w:tcMar>
+              <w:top w:type="dxa" w:w="70"/>
+              <w:left w:type="dxa" w:w="110"/>
+              <w:bottom w:type="dxa" w:w="70"/>
+              <w:right w:type="dxa" w:w="110"/>
+            </w:tcMar>
+            <w:vAlign w:val="center"/>
+          </w:tcPr>
+          <w:p>
+            <w:pPr>
+              <w:spacing w:after="0"/>
+            </w:pPr>
+            <w:r>
+              <w:rPr>
+                <w:b w:val="false"/>
+                <w:bCs w:val="false"/>
+                <w:sz w:val="17"/>
+                <w:szCs w:val="17"/>
+              </w:rPr>
+              <w:t xml:space="preserve">Nada aberto sobre os municípios</w:t>
+            </w:r>
+          </w:p>
+        </w:tc>
+        <w:tc>
+          <w:tcPr>
+            <w:tcW w:type="dxa" w:w="4600"/>
+            <w:shd w:fill="F2F2F2" w:val="clear"/>
+            <w:tcMar>
+              <w:top w:type="dxa" w:w="70"/>
+              <w:left w:type="dxa" w:w="110"/>
+              <w:bottom w:type="dxa" w:w="70"/>
+              <w:right w:type="dxa" w:w="110"/>
+            </w:tcMar>
+            <w:vAlign w:val="center"/>
+          </w:tcPr>
+          <w:p>
+            <w:pPr>
+              <w:spacing w:after="0"/>
+            </w:pPr>
+            <w:r>
+              <w:rPr>
+                <w:b w:val="false"/>
+                <w:bCs w:val="false"/>
+                <w:sz w:val="17"/>
+                <w:szCs w:val="17"/>
+              </w:rPr>
+              <w:t xml:space="preserve">Os demais; a API do TCE-RN estava fora do ar</w:t>
+            </w:r>
+          </w:p>
+        </w:tc>
+        <w:tc>
+          <w:tcPr>
+            <w:tcW w:type="dxa" w:w="2000"/>
+            <w:shd w:fill="F2F2F2" w:val="clear"/>
+            <w:tcMar>
+              <w:top w:type="dxa" w:w="70"/>
+              <w:left w:type="dxa" w:w="110"/>
+              <w:bottom w:type="dxa" w:w="70"/>
+              <w:right w:type="dxa" w:w="110"/>
+            </w:tcMar>
+            <w:vAlign w:val="center"/>
+          </w:tcPr>
+          <w:p>
+            <w:pPr>
+              <w:spacing w:after="0"/>
+            </w:pPr>
+            <w:r>
+              <w:rPr>
+                <w:b w:val="false"/>
+                <w:bCs w:val="false"/>
+                <w:sz w:val="17"/>
+                <w:szCs w:val="17"/>
+              </w:rPr>
+              <w:t xml:space="preserve">—</w:t>
+            </w:r>
+          </w:p>
+        </w:tc>
+      </w:tr>
+    </w:tbl>
+    <w:p>
+      <w:pPr>
+        <w:spacing w:after="120"/>
+      </w:pPr>
+      <w:r>
+        <w:rPr>
+          <w:b w:val="false"/>
+          <w:bCs w:val="false"/>
+          <w:i w:val="false"/>
+          <w:iCs w:val="false"/>
+        </w:rPr>
+        <w:t xml:space="preserve">Ordem de integração: TCE-RS (em uso desde 21/10/2026: contratos de 2016 em diante, lidos por partes no servidor), TCE-SP, TCE-PR, TCE-PE e TCE-CE, perto de 1.900 municípios. Para os cinco atrás de captcha ou token, pedido formal de acesso automatizado ou pela Lei de Acesso à Informação; o do TCE-MT antes de 2027, quando 2021 sai da janela de seis anos do Radar.</w:t>
+      </w:r>
+    </w:p>
+    <w:p>
+      <w:pPr>
         <w:pStyle w:val="Heading1"/>
         <w:keepNext/>
         <w:keepLines/>
         <w:spacing w:after="160" w:before="380"/>
       </w:pPr>
-      <w:bookmarkStart w:name="_Toc16" w:id="16"/>
+      <w:bookmarkStart w:name="_Toc17" w:id="17"/>
       <w:r>
         <w:t xml:space="preserve">4. Camada 3 — Municípios</w:t>
       </w:r>
-      <w:bookmarkEnd w:id="16"/>
+      <w:bookmarkEnd w:id="17"/>
     </w:p>
     <w:p>
       <w:pPr>
@@ -9232,11 +9747,11 @@
         <w:keepLines/>
         <w:spacing w:after="120" w:before="280"/>
       </w:pPr>
-      <w:bookmarkStart w:name="_Toc17" w:id="17"/>
+      <w:bookmarkStart w:name="_Toc18" w:id="18"/>
       <w:r>
         <w:t xml:space="preserve">4.1 Abordagem por família de plataforma</w:t>
       </w:r>
-      <w:bookmarkEnd w:id="17"/>
+      <w:bookmarkEnd w:id="18"/>
     </w:p>
     <w:p>
       <w:pPr>
@@ -9365,11 +9880,11 @@
         <w:keepLines/>
         <w:spacing w:after="120" w:before="280"/>
       </w:pPr>
-      <w:bookmarkStart w:name="_Toc18" w:id="18"/>
+      <w:bookmarkStart w:name="_Toc19" w:id="19"/>
       <w:r>
         <w:t xml:space="preserve">4.2 Cauda longa</w:t>
       </w:r>
-      <w:bookmarkEnd w:id="18"/>
+      <w:bookmarkEnd w:id="19"/>
     </w:p>
     <w:tbl>
       <w:tblPr>
@@ -9810,11 +10325,11 @@
         <w:keepLines/>
         <w:spacing w:after="120" w:before="280"/>
       </w:pPr>
-      <w:bookmarkStart w:name="_Toc19" w:id="19"/>
+      <w:bookmarkStart w:name="_Toc20" w:id="20"/>
       <w:r>
         <w:t xml:space="preserve">4.3 Especificação declarativa de fonte</w:t>
       </w:r>
-      <w:bookmarkEnd w:id="19"/>
+      <w:bookmarkEnd w:id="20"/>
     </w:p>
     <w:p>
       <w:pPr>
@@ -11126,11 +11641,11 @@
         <w:keepLines/>
         <w:spacing w:after="160" w:before="380"/>
       </w:pPr>
-      <w:bookmarkStart w:name="_Toc20" w:id="20"/>
+      <w:bookmarkStart w:name="_Toc21" w:id="21"/>
       <w:r>
         <w:t xml:space="preserve">5. Política de coleta responsável</w:t>
       </w:r>
-      <w:bookmarkEnd w:id="20"/>
+      <w:bookmarkEnd w:id="21"/>
     </w:p>
     <w:p>
       <w:pPr>
@@ -11998,11 +12513,11 @@
         <w:keepLines/>
         <w:spacing w:after="160" w:before="380"/>
       </w:pPr>
-      <w:bookmarkStart w:name="_Toc21" w:id="21"/>
+      <w:bookmarkStart w:name="_Toc22" w:id="22"/>
       <w:r>
         <w:t xml:space="preserve">6. Matriz de cobertura esperada por fase</w:t>
       </w:r>
-      <w:bookmarkEnd w:id="21"/>
+      <w:bookmarkEnd w:id="22"/>
     </w:p>
     <w:tbl>
       <w:tblPr>
@@ -12548,11 +13063,11 @@
         <w:keepLines/>
         <w:spacing w:after="160" w:before="380"/>
       </w:pPr>
-      <w:bookmarkStart w:name="_Toc22" w:id="22"/>
+      <w:bookmarkStart w:name="_Toc23" w:id="23"/>
       <w:r>
         <w:t xml:space="preserve">7. Situação da integração (outubro de 2026)</w:t>
       </w:r>
-      <w:bookmarkEnd w:id="22"/>
+      <w:bookmarkEnd w:id="23"/>
     </w:p>
     <w:tbl>
       <w:tblPr>
@@ -13872,11 +14387,11 @@
         <w:keepLines/>
         <w:spacing w:after="160" w:before="380"/>
       </w:pPr>
-      <w:bookmarkStart w:name="_Toc23" w:id="23"/>
+      <w:bookmarkStart w:name="_Toc24" w:id="24"/>
       <w:r>
         <w:t xml:space="preserve">8. Registro de fontes</w:t>
       </w:r>
-      <w:bookmarkEnd w:id="23"/>
+      <w:bookmarkEnd w:id="24"/>
     </w:p>
     <w:p>
       <w:pPr>

</xml_diff>